<commit_message>
Did stuff on word doc
</commit_message>
<xml_diff>
--- a/NEA_250485.docx
+++ b/NEA_250485.docx
@@ -856,7 +856,6 @@
           <w:kern w:val="2"/>
           <w:sz w:val="22"/>
           <w:szCs w:val="22"/>
-          <w:u w:val="none"/>
           <w:lang w:eastAsia="en-US"/>
           <w14:ligatures w14:val="standardContextual"/>
         </w:rPr>
@@ -902,7 +901,7 @@
           <w:r>
             <w:fldChar w:fldCharType="separate"/>
           </w:r>
-          <w:hyperlink w:anchor="_Toc222835366" w:history="1">
+          <w:hyperlink w:anchor="_Toc224131414" w:history="1">
             <w:r>
               <w:rPr>
                 <w:rStyle w:val="Hyperlink"/>
@@ -929,7 +928,7 @@
                 <w:noProof/>
                 <w:webHidden/>
               </w:rPr>
-              <w:instrText xml:space="preserve"> PAGEREF _Toc222835366 \h </w:instrText>
+              <w:instrText xml:space="preserve"> PAGEREF _Toc224131414 \h </w:instrText>
             </w:r>
             <w:r>
               <w:rPr>
@@ -971,13 +970,13 @@
               <w:lang w:val="en-GB" w:eastAsia="en-GB"/>
             </w:rPr>
           </w:pPr>
-          <w:hyperlink w:anchor="_Toc222835367" w:history="1">
+          <w:hyperlink w:anchor="_Toc224131415" w:history="1">
             <w:r>
               <w:rPr>
                 <w:rStyle w:val="Hyperlink"/>
                 <w:noProof/>
               </w:rPr>
-              <w:t>Introduction</w:t>
+              <w:t>Background Description</w:t>
             </w:r>
             <w:r>
               <w:rPr>
@@ -998,7 +997,7 @@
                 <w:noProof/>
                 <w:webHidden/>
               </w:rPr>
-              <w:instrText xml:space="preserve"> PAGEREF _Toc222835367 \h </w:instrText>
+              <w:instrText xml:space="preserve"> PAGEREF _Toc224131415 \h </w:instrText>
             </w:r>
             <w:r>
               <w:rPr>
@@ -1040,13 +1039,13 @@
               <w:lang w:val="en-GB" w:eastAsia="en-GB"/>
             </w:rPr>
           </w:pPr>
-          <w:hyperlink w:anchor="_Toc222835368" w:history="1">
+          <w:hyperlink w:anchor="_Toc224131416" w:history="1">
             <w:r>
               <w:rPr>
                 <w:rStyle w:val="Hyperlink"/>
                 <w:noProof/>
               </w:rPr>
-              <w:t>Problem Outline</w:t>
+              <w:t>Introduction</w:t>
             </w:r>
             <w:r>
               <w:rPr>
@@ -1067,7 +1066,7 @@
                 <w:noProof/>
                 <w:webHidden/>
               </w:rPr>
-              <w:instrText xml:space="preserve"> PAGEREF _Toc222835368 \h </w:instrText>
+              <w:instrText xml:space="preserve"> PAGEREF _Toc224131416 \h </w:instrText>
             </w:r>
             <w:r>
               <w:rPr>
@@ -1109,13 +1108,13 @@
               <w:lang w:val="en-GB" w:eastAsia="en-GB"/>
             </w:rPr>
           </w:pPr>
-          <w:hyperlink w:anchor="_Toc222835369" w:history="1">
+          <w:hyperlink w:anchor="_Toc224131417" w:history="1">
             <w:r>
               <w:rPr>
                 <w:rStyle w:val="Hyperlink"/>
                 <w:noProof/>
               </w:rPr>
-              <w:t>Background Description</w:t>
+              <w:t>Problem Outline</w:t>
             </w:r>
             <w:r>
               <w:rPr>
@@ -1136,7 +1135,7 @@
                 <w:noProof/>
                 <w:webHidden/>
               </w:rPr>
-              <w:instrText xml:space="preserve"> PAGEREF _Toc222835369 \h </w:instrText>
+              <w:instrText xml:space="preserve"> PAGEREF _Toc224131417 \h </w:instrText>
             </w:r>
             <w:r>
               <w:rPr>
@@ -1178,7 +1177,7 @@
               <w:lang w:val="en-GB" w:eastAsia="en-GB"/>
             </w:rPr>
           </w:pPr>
-          <w:hyperlink w:anchor="_Toc222835370" w:history="1">
+          <w:hyperlink w:anchor="_Toc224131418" w:history="1">
             <w:r>
               <w:rPr>
                 <w:rStyle w:val="Hyperlink"/>
@@ -1205,7 +1204,7 @@
                 <w:noProof/>
                 <w:webHidden/>
               </w:rPr>
-              <w:instrText xml:space="preserve"> PAGEREF _Toc222835370 \h </w:instrText>
+              <w:instrText xml:space="preserve"> PAGEREF _Toc224131418 \h </w:instrText>
             </w:r>
             <w:r>
               <w:rPr>
@@ -1225,7 +1224,421 @@
                 <w:noProof/>
                 <w:webHidden/>
               </w:rPr>
-              <w:t>1</w:t>
+              <w:t>2</w:t>
+            </w:r>
+            <w:r>
+              <w:rPr>
+                <w:noProof/>
+                <w:webHidden/>
+              </w:rPr>
+              <w:fldChar w:fldCharType="end"/>
+            </w:r>
+          </w:hyperlink>
+        </w:p>
+        <w:p>
+          <w:pPr>
+            <w:pStyle w:val="TOC3"/>
+            <w:tabs>
+              <w:tab w:val="right" w:leader="dot" w:pos="9016"/>
+            </w:tabs>
+            <w:rPr>
+              <w:noProof/>
+              <w:lang w:val="en-GB" w:eastAsia="en-GB"/>
+            </w:rPr>
+          </w:pPr>
+          <w:hyperlink w:anchor="_Toc224131419" w:history="1">
+            <w:r>
+              <w:rPr>
+                <w:rStyle w:val="Hyperlink"/>
+                <w:noProof/>
+              </w:rPr>
+              <w:t>clocktower.online</w:t>
+            </w:r>
+            <w:r>
+              <w:rPr>
+                <w:noProof/>
+                <w:webHidden/>
+              </w:rPr>
+              <w:tab/>
+            </w:r>
+            <w:r>
+              <w:rPr>
+                <w:noProof/>
+                <w:webHidden/>
+              </w:rPr>
+              <w:fldChar w:fldCharType="begin"/>
+            </w:r>
+            <w:r>
+              <w:rPr>
+                <w:noProof/>
+                <w:webHidden/>
+              </w:rPr>
+              <w:instrText xml:space="preserve"> PAGEREF _Toc224131419 \h </w:instrText>
+            </w:r>
+            <w:r>
+              <w:rPr>
+                <w:noProof/>
+                <w:webHidden/>
+              </w:rPr>
+            </w:r>
+            <w:r>
+              <w:rPr>
+                <w:noProof/>
+                <w:webHidden/>
+              </w:rPr>
+              <w:fldChar w:fldCharType="separate"/>
+            </w:r>
+            <w:r>
+              <w:rPr>
+                <w:noProof/>
+                <w:webHidden/>
+              </w:rPr>
+              <w:t>2</w:t>
+            </w:r>
+            <w:r>
+              <w:rPr>
+                <w:noProof/>
+                <w:webHidden/>
+              </w:rPr>
+              <w:fldChar w:fldCharType="end"/>
+            </w:r>
+          </w:hyperlink>
+        </w:p>
+        <w:p>
+          <w:pPr>
+            <w:pStyle w:val="TOC3"/>
+            <w:tabs>
+              <w:tab w:val="right" w:leader="dot" w:pos="9016"/>
+            </w:tabs>
+            <w:rPr>
+              <w:noProof/>
+              <w:lang w:val="en-GB" w:eastAsia="en-GB"/>
+            </w:rPr>
+          </w:pPr>
+          <w:hyperlink w:anchor="_Toc224131420" w:history="1">
+            <w:r>
+              <w:rPr>
+                <w:rStyle w:val="Hyperlink"/>
+                <w:noProof/>
+              </w:rPr>
+              <w:t>botc.games</w:t>
+            </w:r>
+            <w:r>
+              <w:rPr>
+                <w:noProof/>
+                <w:webHidden/>
+              </w:rPr>
+              <w:tab/>
+            </w:r>
+            <w:r>
+              <w:rPr>
+                <w:noProof/>
+                <w:webHidden/>
+              </w:rPr>
+              <w:fldChar w:fldCharType="begin"/>
+            </w:r>
+            <w:r>
+              <w:rPr>
+                <w:noProof/>
+                <w:webHidden/>
+              </w:rPr>
+              <w:instrText xml:space="preserve"> PAGEREF _Toc224131420 \h </w:instrText>
+            </w:r>
+            <w:r>
+              <w:rPr>
+                <w:noProof/>
+                <w:webHidden/>
+              </w:rPr>
+            </w:r>
+            <w:r>
+              <w:rPr>
+                <w:noProof/>
+                <w:webHidden/>
+              </w:rPr>
+              <w:fldChar w:fldCharType="separate"/>
+            </w:r>
+            <w:r>
+              <w:rPr>
+                <w:noProof/>
+                <w:webHidden/>
+              </w:rPr>
+              <w:t>3</w:t>
+            </w:r>
+            <w:r>
+              <w:rPr>
+                <w:noProof/>
+                <w:webHidden/>
+              </w:rPr>
+              <w:fldChar w:fldCharType="end"/>
+            </w:r>
+          </w:hyperlink>
+        </w:p>
+        <w:p>
+          <w:pPr>
+            <w:pStyle w:val="TOC3"/>
+            <w:tabs>
+              <w:tab w:val="right" w:leader="dot" w:pos="9016"/>
+            </w:tabs>
+            <w:rPr>
+              <w:noProof/>
+              <w:lang w:val="en-GB" w:eastAsia="en-GB"/>
+            </w:rPr>
+          </w:pPr>
+          <w:hyperlink w:anchor="_Toc224131421" w:history="1">
+            <w:r>
+              <w:rPr>
+                <w:rStyle w:val="Hyperlink"/>
+                <w:noProof/>
+              </w:rPr>
+              <w:t>grimmy.app</w:t>
+            </w:r>
+            <w:r>
+              <w:rPr>
+                <w:noProof/>
+                <w:webHidden/>
+              </w:rPr>
+              <w:tab/>
+            </w:r>
+            <w:r>
+              <w:rPr>
+                <w:noProof/>
+                <w:webHidden/>
+              </w:rPr>
+              <w:fldChar w:fldCharType="begin"/>
+            </w:r>
+            <w:r>
+              <w:rPr>
+                <w:noProof/>
+                <w:webHidden/>
+              </w:rPr>
+              <w:instrText xml:space="preserve"> PAGEREF _Toc224131421 \h </w:instrText>
+            </w:r>
+            <w:r>
+              <w:rPr>
+                <w:noProof/>
+                <w:webHidden/>
+              </w:rPr>
+            </w:r>
+            <w:r>
+              <w:rPr>
+                <w:noProof/>
+                <w:webHidden/>
+              </w:rPr>
+              <w:fldChar w:fldCharType="separate"/>
+            </w:r>
+            <w:r>
+              <w:rPr>
+                <w:noProof/>
+                <w:webHidden/>
+              </w:rPr>
+              <w:t>4</w:t>
+            </w:r>
+            <w:r>
+              <w:rPr>
+                <w:noProof/>
+                <w:webHidden/>
+              </w:rPr>
+              <w:fldChar w:fldCharType="end"/>
+            </w:r>
+          </w:hyperlink>
+        </w:p>
+        <w:p>
+          <w:pPr>
+            <w:pStyle w:val="TOC3"/>
+            <w:tabs>
+              <w:tab w:val="right" w:leader="dot" w:pos="9016"/>
+            </w:tabs>
+            <w:rPr>
+              <w:noProof/>
+              <w:lang w:val="en-GB" w:eastAsia="en-GB"/>
+            </w:rPr>
+          </w:pPr>
+          <w:hyperlink w:anchor="_Toc224131422" w:history="1">
+            <w:r>
+              <w:rPr>
+                <w:rStyle w:val="Hyperlink"/>
+                <w:noProof/>
+              </w:rPr>
+              <w:t>Pocket Grimoire</w:t>
+            </w:r>
+            <w:r>
+              <w:rPr>
+                <w:noProof/>
+                <w:webHidden/>
+              </w:rPr>
+              <w:tab/>
+            </w:r>
+            <w:r>
+              <w:rPr>
+                <w:noProof/>
+                <w:webHidden/>
+              </w:rPr>
+              <w:fldChar w:fldCharType="begin"/>
+            </w:r>
+            <w:r>
+              <w:rPr>
+                <w:noProof/>
+                <w:webHidden/>
+              </w:rPr>
+              <w:instrText xml:space="preserve"> PAGEREF _Toc224131422 \h </w:instrText>
+            </w:r>
+            <w:r>
+              <w:rPr>
+                <w:noProof/>
+                <w:webHidden/>
+              </w:rPr>
+            </w:r>
+            <w:r>
+              <w:rPr>
+                <w:noProof/>
+                <w:webHidden/>
+              </w:rPr>
+              <w:fldChar w:fldCharType="separate"/>
+            </w:r>
+            <w:r>
+              <w:rPr>
+                <w:noProof/>
+                <w:webHidden/>
+              </w:rPr>
+              <w:t>5</w:t>
+            </w:r>
+            <w:r>
+              <w:rPr>
+                <w:noProof/>
+                <w:webHidden/>
+              </w:rPr>
+              <w:fldChar w:fldCharType="end"/>
+            </w:r>
+          </w:hyperlink>
+        </w:p>
+        <w:p>
+          <w:pPr>
+            <w:pStyle w:val="TOC3"/>
+            <w:tabs>
+              <w:tab w:val="right" w:leader="dot" w:pos="9016"/>
+            </w:tabs>
+            <w:rPr>
+              <w:noProof/>
+              <w:lang w:val="en-GB" w:eastAsia="en-GB"/>
+            </w:rPr>
+          </w:pPr>
+          <w:hyperlink w:anchor="_Toc224131423" w:history="1">
+            <w:r>
+              <w:rPr>
+                <w:rStyle w:val="Hyperlink"/>
+                <w:noProof/>
+              </w:rPr>
+              <w:t>the-grim.netlify.app</w:t>
+            </w:r>
+            <w:r>
+              <w:rPr>
+                <w:noProof/>
+                <w:webHidden/>
+              </w:rPr>
+              <w:tab/>
+            </w:r>
+            <w:r>
+              <w:rPr>
+                <w:noProof/>
+                <w:webHidden/>
+              </w:rPr>
+              <w:fldChar w:fldCharType="begin"/>
+            </w:r>
+            <w:r>
+              <w:rPr>
+                <w:noProof/>
+                <w:webHidden/>
+              </w:rPr>
+              <w:instrText xml:space="preserve"> PAGEREF _Toc224131423 \h </w:instrText>
+            </w:r>
+            <w:r>
+              <w:rPr>
+                <w:noProof/>
+                <w:webHidden/>
+              </w:rPr>
+            </w:r>
+            <w:r>
+              <w:rPr>
+                <w:noProof/>
+                <w:webHidden/>
+              </w:rPr>
+              <w:fldChar w:fldCharType="separate"/>
+            </w:r>
+            <w:r>
+              <w:rPr>
+                <w:noProof/>
+                <w:webHidden/>
+              </w:rPr>
+              <w:t>6</w:t>
+            </w:r>
+            <w:r>
+              <w:rPr>
+                <w:noProof/>
+                <w:webHidden/>
+              </w:rPr>
+              <w:fldChar w:fldCharType="end"/>
+            </w:r>
+          </w:hyperlink>
+        </w:p>
+        <w:p>
+          <w:pPr>
+            <w:pStyle w:val="TOC3"/>
+            <w:tabs>
+              <w:tab w:val="right" w:leader="dot" w:pos="9016"/>
+            </w:tabs>
+            <w:rPr>
+              <w:noProof/>
+              <w:lang w:val="en-GB" w:eastAsia="en-GB"/>
+            </w:rPr>
+          </w:pPr>
+          <w:hyperlink w:anchor="_Toc224131424" w:history="1">
+            <w:r>
+              <w:rPr>
+                <w:rStyle w:val="Hyperlink"/>
+                <w:noProof/>
+              </w:rPr>
+              <w:t>botc.app</w:t>
+            </w:r>
+            <w:r>
+              <w:rPr>
+                <w:noProof/>
+                <w:webHidden/>
+              </w:rPr>
+              <w:tab/>
+            </w:r>
+            <w:r>
+              <w:rPr>
+                <w:noProof/>
+                <w:webHidden/>
+              </w:rPr>
+              <w:fldChar w:fldCharType="begin"/>
+            </w:r>
+            <w:r>
+              <w:rPr>
+                <w:noProof/>
+                <w:webHidden/>
+              </w:rPr>
+              <w:instrText xml:space="preserve"> PAGEREF _Toc224131424 \h </w:instrText>
+            </w:r>
+            <w:r>
+              <w:rPr>
+                <w:noProof/>
+                <w:webHidden/>
+              </w:rPr>
+            </w:r>
+            <w:r>
+              <w:rPr>
+                <w:noProof/>
+                <w:webHidden/>
+              </w:rPr>
+              <w:fldChar w:fldCharType="separate"/>
+            </w:r>
+            <w:r>
+              <w:rPr>
+                <w:noProof/>
+                <w:webHidden/>
+              </w:rPr>
+              <w:t>7</w:t>
             </w:r>
             <w:r>
               <w:rPr>
@@ -1247,7 +1660,7 @@
               <w:lang w:val="en-GB" w:eastAsia="en-GB"/>
             </w:rPr>
           </w:pPr>
-          <w:hyperlink w:anchor="_Toc222835371" w:history="1">
+          <w:hyperlink w:anchor="_Toc224131425" w:history="1">
             <w:r>
               <w:rPr>
                 <w:rStyle w:val="Hyperlink"/>
@@ -1274,7 +1687,7 @@
                 <w:noProof/>
                 <w:webHidden/>
               </w:rPr>
-              <w:instrText xml:space="preserve"> PAGEREF _Toc222835371 \h </w:instrText>
+              <w:instrText xml:space="preserve"> PAGEREF _Toc224131425 \h </w:instrText>
             </w:r>
             <w:r>
               <w:rPr>
@@ -1294,7 +1707,76 @@
                 <w:noProof/>
                 <w:webHidden/>
               </w:rPr>
-              <w:t>1</w:t>
+              <w:t>8</w:t>
+            </w:r>
+            <w:r>
+              <w:rPr>
+                <w:noProof/>
+                <w:webHidden/>
+              </w:rPr>
+              <w:fldChar w:fldCharType="end"/>
+            </w:r>
+          </w:hyperlink>
+        </w:p>
+        <w:p>
+          <w:pPr>
+            <w:pStyle w:val="TOC3"/>
+            <w:tabs>
+              <w:tab w:val="right" w:leader="dot" w:pos="9016"/>
+            </w:tabs>
+            <w:rPr>
+              <w:noProof/>
+              <w:lang w:val="en-GB" w:eastAsia="en-GB"/>
+            </w:rPr>
+          </w:pPr>
+          <w:hyperlink w:anchor="_Toc224131426" w:history="1">
+            <w:r>
+              <w:rPr>
+                <w:rStyle w:val="Hyperlink"/>
+                <w:noProof/>
+              </w:rPr>
+              <w:t>Summary</w:t>
+            </w:r>
+            <w:r>
+              <w:rPr>
+                <w:noProof/>
+                <w:webHidden/>
+              </w:rPr>
+              <w:tab/>
+            </w:r>
+            <w:r>
+              <w:rPr>
+                <w:noProof/>
+                <w:webHidden/>
+              </w:rPr>
+              <w:fldChar w:fldCharType="begin"/>
+            </w:r>
+            <w:r>
+              <w:rPr>
+                <w:noProof/>
+                <w:webHidden/>
+              </w:rPr>
+              <w:instrText xml:space="preserve"> PAGEREF _Toc224131426 \h </w:instrText>
+            </w:r>
+            <w:r>
+              <w:rPr>
+                <w:noProof/>
+                <w:webHidden/>
+              </w:rPr>
+            </w:r>
+            <w:r>
+              <w:rPr>
+                <w:noProof/>
+                <w:webHidden/>
+              </w:rPr>
+              <w:fldChar w:fldCharType="separate"/>
+            </w:r>
+            <w:r>
+              <w:rPr>
+                <w:noProof/>
+                <w:webHidden/>
+              </w:rPr>
+              <w:t>8</w:t>
             </w:r>
             <w:r>
               <w:rPr>
@@ -1316,7 +1798,7 @@
               <w:lang w:val="en-GB" w:eastAsia="en-GB"/>
             </w:rPr>
           </w:pPr>
-          <w:hyperlink w:anchor="_Toc222835372" w:history="1">
+          <w:hyperlink w:anchor="_Toc224131427" w:history="1">
             <w:r>
               <w:rPr>
                 <w:rStyle w:val="Hyperlink"/>
@@ -1343,7 +1825,7 @@
                 <w:noProof/>
                 <w:webHidden/>
               </w:rPr>
-              <w:instrText xml:space="preserve"> PAGEREF _Toc222835372 \h </w:instrText>
+              <w:instrText xml:space="preserve"> PAGEREF _Toc224131427 \h </w:instrText>
             </w:r>
             <w:r>
               <w:rPr>
@@ -1363,7 +1845,7 @@
                 <w:noProof/>
                 <w:webHidden/>
               </w:rPr>
-              <w:t>1</w:t>
+              <w:t>8</w:t>
             </w:r>
             <w:r>
               <w:rPr>
@@ -1385,7 +1867,7 @@
               <w:lang w:val="en-GB" w:eastAsia="en-GB"/>
             </w:rPr>
           </w:pPr>
-          <w:hyperlink w:anchor="_Toc222835373" w:history="1">
+          <w:hyperlink w:anchor="_Toc224131428" w:history="1">
             <w:r>
               <w:rPr>
                 <w:rStyle w:val="Hyperlink"/>
@@ -1412,7 +1894,7 @@
                 <w:noProof/>
                 <w:webHidden/>
               </w:rPr>
-              <w:instrText xml:space="preserve"> PAGEREF _Toc222835373 \h </w:instrText>
+              <w:instrText xml:space="preserve"> PAGEREF _Toc224131428 \h </w:instrText>
             </w:r>
             <w:r>
               <w:rPr>
@@ -1432,7 +1914,7 @@
                 <w:noProof/>
                 <w:webHidden/>
               </w:rPr>
-              <w:t>1</w:t>
+              <w:t>8</w:t>
             </w:r>
             <w:r>
               <w:rPr>
@@ -1454,7 +1936,7 @@
               <w:lang w:val="en-GB" w:eastAsia="en-GB"/>
             </w:rPr>
           </w:pPr>
-          <w:hyperlink w:anchor="_Toc222835374" w:history="1">
+          <w:hyperlink w:anchor="_Toc224131429" w:history="1">
             <w:r>
               <w:rPr>
                 <w:rStyle w:val="Hyperlink"/>
@@ -1481,7 +1963,7 @@
                 <w:noProof/>
                 <w:webHidden/>
               </w:rPr>
-              <w:instrText xml:space="preserve"> PAGEREF _Toc222835374 \h </w:instrText>
+              <w:instrText xml:space="preserve"> PAGEREF _Toc224131429 \h </w:instrText>
             </w:r>
             <w:r>
               <w:rPr>
@@ -1501,7 +1983,7 @@
                 <w:noProof/>
                 <w:webHidden/>
               </w:rPr>
-              <w:t>1</w:t>
+              <w:t>8</w:t>
             </w:r>
             <w:r>
               <w:rPr>
@@ -1523,7 +2005,7 @@
               <w:lang w:val="en-GB" w:eastAsia="en-GB"/>
             </w:rPr>
           </w:pPr>
-          <w:hyperlink w:anchor="_Toc222835375" w:history="1">
+          <w:hyperlink w:anchor="_Toc224131430" w:history="1">
             <w:r>
               <w:rPr>
                 <w:rStyle w:val="Hyperlink"/>
@@ -1550,7 +2032,7 @@
                 <w:noProof/>
                 <w:webHidden/>
               </w:rPr>
-              <w:instrText xml:space="preserve"> PAGEREF _Toc222835375 \h </w:instrText>
+              <w:instrText xml:space="preserve"> PAGEREF _Toc224131430 \h </w:instrText>
             </w:r>
             <w:r>
               <w:rPr>
@@ -1570,7 +2052,7 @@
                 <w:noProof/>
                 <w:webHidden/>
               </w:rPr>
-              <w:t>2</w:t>
+              <w:t>9</w:t>
             </w:r>
             <w:r>
               <w:rPr>
@@ -1592,7 +2074,7 @@
               <w:lang w:val="en-GB" w:eastAsia="en-GB"/>
             </w:rPr>
           </w:pPr>
-          <w:hyperlink w:anchor="_Toc222835376" w:history="1">
+          <w:hyperlink w:anchor="_Toc224131431" w:history="1">
             <w:r>
               <w:rPr>
                 <w:rStyle w:val="Hyperlink"/>
@@ -1619,7 +2101,7 @@
                 <w:noProof/>
                 <w:webHidden/>
               </w:rPr>
-              <w:instrText xml:space="preserve"> PAGEREF _Toc222835376 \h </w:instrText>
+              <w:instrText xml:space="preserve"> PAGEREF _Toc224131431 \h </w:instrText>
             </w:r>
             <w:r>
               <w:rPr>
@@ -1639,7 +2121,7 @@
                 <w:noProof/>
                 <w:webHidden/>
               </w:rPr>
-              <w:t>3</w:t>
+              <w:t>10</w:t>
             </w:r>
             <w:r>
               <w:rPr>
@@ -1661,7 +2143,7 @@
               <w:lang w:val="en-GB" w:eastAsia="en-GB"/>
             </w:rPr>
           </w:pPr>
-          <w:hyperlink w:anchor="_Toc222835377" w:history="1">
+          <w:hyperlink w:anchor="_Toc224131432" w:history="1">
             <w:r>
               <w:rPr>
                 <w:rStyle w:val="Hyperlink"/>
@@ -1688,7 +2170,7 @@
                 <w:noProof/>
                 <w:webHidden/>
               </w:rPr>
-              <w:instrText xml:space="preserve"> PAGEREF _Toc222835377 \h </w:instrText>
+              <w:instrText xml:space="preserve"> PAGEREF _Toc224131432 \h </w:instrText>
             </w:r>
             <w:r>
               <w:rPr>
@@ -1708,7 +2190,7 @@
                 <w:noProof/>
                 <w:webHidden/>
               </w:rPr>
-              <w:t>4</w:t>
+              <w:t>11</w:t>
             </w:r>
             <w:r>
               <w:rPr>
@@ -1730,7 +2212,7 @@
               <w:lang w:val="en-GB" w:eastAsia="en-GB"/>
             </w:rPr>
           </w:pPr>
-          <w:hyperlink w:anchor="_Toc222835378" w:history="1">
+          <w:hyperlink w:anchor="_Toc224131433" w:history="1">
             <w:r>
               <w:rPr>
                 <w:rStyle w:val="Hyperlink"/>
@@ -1757,7 +2239,7 @@
                 <w:noProof/>
                 <w:webHidden/>
               </w:rPr>
-              <w:instrText xml:space="preserve"> PAGEREF _Toc222835378 \h </w:instrText>
+              <w:instrText xml:space="preserve"> PAGEREF _Toc224131433 \h </w:instrText>
             </w:r>
             <w:r>
               <w:rPr>
@@ -1777,7 +2259,7 @@
                 <w:noProof/>
                 <w:webHidden/>
               </w:rPr>
-              <w:t>5</w:t>
+              <w:t>12</w:t>
             </w:r>
             <w:r>
               <w:rPr>
@@ -1799,7 +2281,7 @@
               <w:lang w:val="en-GB" w:eastAsia="en-GB"/>
             </w:rPr>
           </w:pPr>
-          <w:hyperlink w:anchor="_Toc222835379" w:history="1">
+          <w:hyperlink w:anchor="_Toc224131434" w:history="1">
             <w:r>
               <w:rPr>
                 <w:rStyle w:val="Hyperlink"/>
@@ -1826,7 +2308,7 @@
                 <w:noProof/>
                 <w:webHidden/>
               </w:rPr>
-              <w:instrText xml:space="preserve"> PAGEREF _Toc222835379 \h </w:instrText>
+              <w:instrText xml:space="preserve"> PAGEREF _Toc224131434 \h </w:instrText>
             </w:r>
             <w:r>
               <w:rPr>
@@ -1846,7 +2328,7 @@
                 <w:noProof/>
                 <w:webHidden/>
               </w:rPr>
-              <w:t>6</w:t>
+              <w:t>13</w:t>
             </w:r>
             <w:r>
               <w:rPr>
@@ -1869,7 +2351,7 @@
               <w:lang w:val="en-GB" w:eastAsia="en-GB"/>
             </w:rPr>
           </w:pPr>
-          <w:hyperlink w:anchor="_Toc222835380" w:history="1">
+          <w:hyperlink w:anchor="_Toc224131435" w:history="1">
             <w:r>
               <w:rPr>
                 <w:rStyle w:val="Hyperlink"/>
@@ -1889,7 +2371,7 @@
                 <w:rStyle w:val="Hyperlink"/>
                 <w:noProof/>
               </w:rPr>
-              <w:t>Code</w:t>
+              <w:t>Additional Images</w:t>
             </w:r>
             <w:r>
               <w:rPr>
@@ -1910,7 +2392,7 @@
                 <w:noProof/>
                 <w:webHidden/>
               </w:rPr>
-              <w:instrText xml:space="preserve"> PAGEREF _Toc222835380 \h </w:instrText>
+              <w:instrText xml:space="preserve"> PAGEREF _Toc224131435 \h </w:instrText>
             </w:r>
             <w:r>
               <w:rPr>
@@ -1930,7 +2412,175 @@
                 <w:noProof/>
                 <w:webHidden/>
               </w:rPr>
-              <w:t>6</w:t>
+              <w:t>13</w:t>
+            </w:r>
+            <w:r>
+              <w:rPr>
+                <w:noProof/>
+                <w:webHidden/>
+              </w:rPr>
+              <w:fldChar w:fldCharType="end"/>
+            </w:r>
+          </w:hyperlink>
+        </w:p>
+        <w:p>
+          <w:pPr>
+            <w:pStyle w:val="TOC3"/>
+            <w:tabs>
+              <w:tab w:val="left" w:pos="880"/>
+              <w:tab w:val="right" w:leader="dot" w:pos="9016"/>
+            </w:tabs>
+            <w:rPr>
+              <w:noProof/>
+              <w:lang w:val="en-GB" w:eastAsia="en-GB"/>
+            </w:rPr>
+          </w:pPr>
+          <w:hyperlink w:anchor="_Toc224131436" w:history="1">
+            <w:r>
+              <w:rPr>
+                <w:rStyle w:val="Hyperlink"/>
+                <w:noProof/>
+              </w:rPr>
+              <w:t>A.</w:t>
+            </w:r>
+            <w:r>
+              <w:rPr>
+                <w:noProof/>
+                <w:lang w:val="en-GB" w:eastAsia="en-GB"/>
+              </w:rPr>
+              <w:tab/>
+            </w:r>
+            <w:r>
+              <w:rPr>
+                <w:rStyle w:val="Hyperlink"/>
+                <w:noProof/>
+              </w:rPr>
+              <w:t>Trouble Brewing</w:t>
+            </w:r>
+            <w:r>
+              <w:rPr>
+                <w:noProof/>
+                <w:webHidden/>
+              </w:rPr>
+              <w:tab/>
+            </w:r>
+            <w:r>
+              <w:rPr>
+                <w:noProof/>
+                <w:webHidden/>
+              </w:rPr>
+              <w:fldChar w:fldCharType="begin"/>
+            </w:r>
+            <w:r>
+              <w:rPr>
+                <w:noProof/>
+                <w:webHidden/>
+              </w:rPr>
+              <w:instrText xml:space="preserve"> PAGEREF _Toc224131436 \h </w:instrText>
+            </w:r>
+            <w:r>
+              <w:rPr>
+                <w:noProof/>
+                <w:webHidden/>
+              </w:rPr>
+            </w:r>
+            <w:r>
+              <w:rPr>
+                <w:noProof/>
+                <w:webHidden/>
+              </w:rPr>
+              <w:fldChar w:fldCharType="separate"/>
+            </w:r>
+            <w:r>
+              <w:rPr>
+                <w:noProof/>
+                <w:webHidden/>
+              </w:rPr>
+              <w:t>13</w:t>
+            </w:r>
+            <w:r>
+              <w:rPr>
+                <w:noProof/>
+                <w:webHidden/>
+              </w:rPr>
+              <w:fldChar w:fldCharType="end"/>
+            </w:r>
+          </w:hyperlink>
+        </w:p>
+        <w:p>
+          <w:pPr>
+            <w:pStyle w:val="TOC3"/>
+            <w:tabs>
+              <w:tab w:val="left" w:pos="880"/>
+              <w:tab w:val="right" w:leader="dot" w:pos="9016"/>
+            </w:tabs>
+            <w:rPr>
+              <w:noProof/>
+              <w:lang w:val="en-GB" w:eastAsia="en-GB"/>
+            </w:rPr>
+          </w:pPr>
+          <w:hyperlink w:anchor="_Toc224131437" w:history="1">
+            <w:r>
+              <w:rPr>
+                <w:rStyle w:val="Hyperlink"/>
+                <w:noProof/>
+              </w:rPr>
+              <w:t>B.</w:t>
+            </w:r>
+            <w:r>
+              <w:rPr>
+                <w:noProof/>
+                <w:lang w:val="en-GB" w:eastAsia="en-GB"/>
+              </w:rPr>
+              <w:tab/>
+            </w:r>
+            <w:r>
+              <w:rPr>
+                <w:rStyle w:val="Hyperlink"/>
+                <w:noProof/>
+              </w:rPr>
+              <w:t>Physical Grimoire</w:t>
+            </w:r>
+            <w:r>
+              <w:rPr>
+                <w:noProof/>
+                <w:webHidden/>
+              </w:rPr>
+              <w:tab/>
+            </w:r>
+            <w:r>
+              <w:rPr>
+                <w:noProof/>
+                <w:webHidden/>
+              </w:rPr>
+              <w:fldChar w:fldCharType="begin"/>
+            </w:r>
+            <w:r>
+              <w:rPr>
+                <w:noProof/>
+                <w:webHidden/>
+              </w:rPr>
+              <w:instrText xml:space="preserve"> PAGEREF _Toc224131437 \h </w:instrText>
+            </w:r>
+            <w:r>
+              <w:rPr>
+                <w:noProof/>
+                <w:webHidden/>
+              </w:rPr>
+            </w:r>
+            <w:r>
+              <w:rPr>
+                <w:noProof/>
+                <w:webHidden/>
+              </w:rPr>
+              <w:fldChar w:fldCharType="separate"/>
+            </w:r>
+            <w:r>
+              <w:rPr>
+                <w:noProof/>
+                <w:webHidden/>
+              </w:rPr>
+              <w:t>14</w:t>
             </w:r>
             <w:r>
               <w:rPr>
@@ -1953,7 +2603,7 @@
               <w:lang w:val="en-GB" w:eastAsia="en-GB"/>
             </w:rPr>
           </w:pPr>
-          <w:hyperlink w:anchor="_Toc222835381" w:history="1">
+          <w:hyperlink w:anchor="_Toc224131438" w:history="1">
             <w:r>
               <w:rPr>
                 <w:rStyle w:val="Hyperlink"/>
@@ -1973,7 +2623,7 @@
                 <w:rStyle w:val="Hyperlink"/>
                 <w:noProof/>
               </w:rPr>
-              <w:t>Full Interview</w:t>
+              <w:t>Code</w:t>
             </w:r>
             <w:r>
               <w:rPr>
@@ -1994,7 +2644,7 @@
                 <w:noProof/>
                 <w:webHidden/>
               </w:rPr>
-              <w:instrText xml:space="preserve"> PAGEREF _Toc222835381 \h </w:instrText>
+              <w:instrText xml:space="preserve"> PAGEREF _Toc224131438 \h </w:instrText>
             </w:r>
             <w:r>
               <w:rPr>
@@ -2014,7 +2664,7 @@
                 <w:noProof/>
                 <w:webHidden/>
               </w:rPr>
-              <w:t>6</w:t>
+              <w:t>14</w:t>
             </w:r>
             <w:r>
               <w:rPr>
@@ -2037,7 +2687,7 @@
               <w:lang w:val="en-GB" w:eastAsia="en-GB"/>
             </w:rPr>
           </w:pPr>
-          <w:hyperlink w:anchor="_Toc222835382" w:history="1">
+          <w:hyperlink w:anchor="_Toc224131439" w:history="1">
             <w:r>
               <w:rPr>
                 <w:rStyle w:val="Hyperlink"/>
@@ -2057,6 +2707,90 @@
                 <w:rStyle w:val="Hyperlink"/>
                 <w:noProof/>
               </w:rPr>
+              <w:t>Full Interview</w:t>
+            </w:r>
+            <w:r>
+              <w:rPr>
+                <w:noProof/>
+                <w:webHidden/>
+              </w:rPr>
+              <w:tab/>
+            </w:r>
+            <w:r>
+              <w:rPr>
+                <w:noProof/>
+                <w:webHidden/>
+              </w:rPr>
+              <w:fldChar w:fldCharType="begin"/>
+            </w:r>
+            <w:r>
+              <w:rPr>
+                <w:noProof/>
+                <w:webHidden/>
+              </w:rPr>
+              <w:instrText xml:space="preserve"> PAGEREF _Toc224131439 \h </w:instrText>
+            </w:r>
+            <w:r>
+              <w:rPr>
+                <w:noProof/>
+                <w:webHidden/>
+              </w:rPr>
+            </w:r>
+            <w:r>
+              <w:rPr>
+                <w:noProof/>
+                <w:webHidden/>
+              </w:rPr>
+              <w:fldChar w:fldCharType="separate"/>
+            </w:r>
+            <w:r>
+              <w:rPr>
+                <w:noProof/>
+                <w:webHidden/>
+              </w:rPr>
+              <w:t>14</w:t>
+            </w:r>
+            <w:r>
+              <w:rPr>
+                <w:noProof/>
+                <w:webHidden/>
+              </w:rPr>
+              <w:fldChar w:fldCharType="end"/>
+            </w:r>
+          </w:hyperlink>
+        </w:p>
+        <w:p>
+          <w:pPr>
+            <w:pStyle w:val="TOC2"/>
+            <w:tabs>
+              <w:tab w:val="left" w:pos="660"/>
+              <w:tab w:val="right" w:leader="dot" w:pos="9016"/>
+            </w:tabs>
+            <w:rPr>
+              <w:noProof/>
+              <w:lang w:val="en-GB" w:eastAsia="en-GB"/>
+            </w:rPr>
+          </w:pPr>
+          <w:hyperlink w:anchor="_Toc224131440" w:history="1">
+            <w:r>
+              <w:rPr>
+                <w:rStyle w:val="Hyperlink"/>
+                <w:noProof/>
+              </w:rPr>
+              <w:t>4.</w:t>
+            </w:r>
+            <w:r>
+              <w:rPr>
+                <w:noProof/>
+                <w:lang w:val="en-GB" w:eastAsia="en-GB"/>
+              </w:rPr>
+              <w:tab/>
+            </w:r>
+            <w:r>
+              <w:rPr>
+                <w:rStyle w:val="Hyperlink"/>
+                <w:noProof/>
+              </w:rPr>
               <w:t>Testing</w:t>
             </w:r>
             <w:r>
@@ -2078,7 +2812,7 @@
                 <w:noProof/>
                 <w:webHidden/>
               </w:rPr>
-              <w:instrText xml:space="preserve"> PAGEREF _Toc222835382 \h </w:instrText>
+              <w:instrText xml:space="preserve"> PAGEREF _Toc224131440 \h </w:instrText>
             </w:r>
             <w:r>
               <w:rPr>
@@ -2098,7 +2832,7 @@
                 <w:noProof/>
                 <w:webHidden/>
               </w:rPr>
-              <w:t>6</w:t>
+              <w:t>14</w:t>
             </w:r>
             <w:r>
               <w:rPr>
@@ -2118,9 +2852,10 @@
             </w:tabs>
             <w:rPr>
               <w:noProof/>
+              <w:lang w:val="en-GB" w:eastAsia="en-GB"/>
             </w:rPr>
           </w:pPr>
-          <w:hyperlink w:anchor="_Toc222835383" w:history="1">
+          <w:hyperlink w:anchor="_Toc224131441" w:history="1">
             <w:r>
               <w:rPr>
                 <w:rStyle w:val="Hyperlink"/>
@@ -2131,6 +2866,7 @@
             <w:r>
               <w:rPr>
                 <w:noProof/>
+                <w:lang w:val="en-GB" w:eastAsia="en-GB"/>
               </w:rPr>
               <w:tab/>
             </w:r>
@@ -2160,7 +2896,7 @@
                 <w:noProof/>
                 <w:webHidden/>
               </w:rPr>
-              <w:instrText xml:space="preserve"> PAGEREF _Toc222835383 \h </w:instrText>
+              <w:instrText xml:space="preserve"> PAGEREF _Toc224131441 \h </w:instrText>
             </w:r>
             <w:r>
               <w:rPr>
@@ -2180,7 +2916,7 @@
                 <w:noProof/>
                 <w:webHidden/>
               </w:rPr>
-              <w:t>6</w:t>
+              <w:t>14</w:t>
             </w:r>
             <w:r>
               <w:rPr>
@@ -2200,9 +2936,10 @@
             </w:tabs>
             <w:rPr>
               <w:noProof/>
+              <w:lang w:val="en-GB" w:eastAsia="en-GB"/>
             </w:rPr>
           </w:pPr>
-          <w:hyperlink w:anchor="_Toc222835384" w:history="1">
+          <w:hyperlink w:anchor="_Toc224131442" w:history="1">
             <w:r>
               <w:rPr>
                 <w:rStyle w:val="Hyperlink"/>
@@ -2213,6 +2950,7 @@
             <w:r>
               <w:rPr>
                 <w:noProof/>
+                <w:lang w:val="en-GB" w:eastAsia="en-GB"/>
               </w:rPr>
               <w:tab/>
             </w:r>
@@ -2242,7 +2980,7 @@
                 <w:noProof/>
                 <w:webHidden/>
               </w:rPr>
-              <w:instrText xml:space="preserve"> PAGEREF _Toc222835384 \h </w:instrText>
+              <w:instrText xml:space="preserve"> PAGEREF _Toc224131442 \h </w:instrText>
             </w:r>
             <w:r>
               <w:rPr>
@@ -2262,7 +3000,7 @@
                 <w:noProof/>
                 <w:webHidden/>
               </w:rPr>
-              <w:t>6</w:t>
+              <w:t>15</w:t>
             </w:r>
             <w:r>
               <w:rPr>
@@ -2284,7 +3022,7 @@
               <w:lang w:val="en-GB" w:eastAsia="en-GB"/>
             </w:rPr>
           </w:pPr>
-          <w:hyperlink w:anchor="_Toc222835385" w:history="1">
+          <w:hyperlink w:anchor="_Toc224131443" w:history="1">
             <w:r>
               <w:rPr>
                 <w:rStyle w:val="Hyperlink"/>
@@ -2311,7 +3049,7 @@
                 <w:noProof/>
                 <w:webHidden/>
               </w:rPr>
-              <w:instrText xml:space="preserve"> PAGEREF _Toc222835385 \h </w:instrText>
+              <w:instrText xml:space="preserve"> PAGEREF _Toc224131443 \h </w:instrText>
             </w:r>
             <w:r>
               <w:rPr>
@@ -2331,7 +3069,7 @@
                 <w:noProof/>
                 <w:webHidden/>
               </w:rPr>
-              <w:t>6</w:t>
+              <w:t>15</w:t>
             </w:r>
             <w:r>
               <w:rPr>
@@ -2365,7 +3103,7 @@
       <w:pPr>
         <w:pStyle w:val="Heading1"/>
       </w:pPr>
-      <w:bookmarkStart w:id="0" w:name="_Toc222835366"/>
+      <w:bookmarkStart w:id="0" w:name="_Toc224131414"/>
       <w:r>
         <w:lastRenderedPageBreak/>
         <w:t>Analysis</w:t>
@@ -2376,154 +3114,1262 @@
       <w:pPr>
         <w:pStyle w:val="Heading2"/>
       </w:pPr>
-      <w:bookmarkStart w:id="1" w:name="_Toc222835367"/>
+      <w:bookmarkStart w:id="1" w:name="_Introduction"/>
+      <w:bookmarkStart w:id="2" w:name="_Background_Description"/>
+      <w:bookmarkStart w:id="3" w:name="_Toc224131415"/>
+      <w:bookmarkEnd w:id="1"/>
+      <w:bookmarkEnd w:id="2"/>
+      <w:r>
+        <w:t>Background Description</w:t>
+      </w:r>
+      <w:bookmarkEnd w:id="3"/>
+    </w:p>
+    <w:p>
+      <w:r>
+        <w:t>##Background of the problem in sufficient detail for a third party to understand the problem</w:t>
+      </w:r>
+    </w:p>
+    <w:p/>
+    <w:p>
+      <w:hyperlink r:id="rId10" w:history="1">
+        <w:r>
+          <w:rPr>
+            <w:rStyle w:val="Hyperlink"/>
+          </w:rPr>
+          <w:t>Blood on the Clocktower</w:t>
+        </w:r>
+      </w:hyperlink>
+      <w:r>
+        <w:t xml:space="preserve"> is a </w:t>
+      </w:r>
+      <w:r>
+        <w:t xml:space="preserve">popular, </w:t>
+      </w:r>
+      <w:r>
+        <w:t xml:space="preserve">Mafia-style </w:t>
+      </w:r>
+      <w:r>
+        <w:t xml:space="preserve">party </w:t>
+      </w:r>
+      <w:r>
+        <w:t>game, where an informed minority of players need to survive and eliminate the uninformed majority in order to win, but where every player has a special ability. In order for it to be played, one person, the “storyteller”, has everyone’s characters in a “grimoire” which allows them to see which players they need to wake, mark who’s alive etc.</w:t>
+      </w:r>
+    </w:p>
+    <w:p>
+      <w:r>
+        <w:t xml:space="preserve">The useable characters come from a “script”, essentially a long list of characters (an example of which is “Trouble Brewing”, the beginner script, pictured in </w:t>
+      </w:r>
+      <w:hyperlink w:anchor="_Physical_Grimoire" w:history="1">
+        <w:r>
+          <w:rPr>
+            <w:rStyle w:val="Hyperlink"/>
+          </w:rPr>
+          <w:t>Appendix 1.A</w:t>
+        </w:r>
+      </w:hyperlink>
+      <w:r>
+        <w:t xml:space="preserve">. These can consist of both official </w:t>
+      </w:r>
+      <w:r>
+        <w:t xml:space="preserve">(released by </w:t>
+      </w:r>
+      <w:hyperlink r:id="rId11" w:history="1">
+        <w:r>
+          <w:rPr>
+            <w:rStyle w:val="Hyperlink"/>
+          </w:rPr>
+          <w:t>The Pandemonium Institute</w:t>
+        </w:r>
+      </w:hyperlink>
+      <w:r>
+        <w:t xml:space="preserve"> (TPI)</w:t>
+      </w:r>
+      <w:r>
+        <w:t>)</w:t>
+      </w:r>
+      <w:r>
+        <w:t xml:space="preserve"> </w:t>
+      </w:r>
+      <w:r>
+        <w:t>and homebrew characters.</w:t>
+      </w:r>
+    </w:p>
+    <w:p>
+      <w:pPr>
+        <w:pStyle w:val="Heading2"/>
+      </w:pPr>
+      <w:bookmarkStart w:id="4" w:name="_Introduction_1"/>
+      <w:bookmarkStart w:id="5" w:name="_Toc224131416"/>
+      <w:bookmarkEnd w:id="4"/>
       <w:r>
         <w:t>Introduction</w:t>
       </w:r>
-      <w:bookmarkEnd w:id="1"/>
-    </w:p>
-    <w:p>
+      <w:bookmarkEnd w:id="5"/>
+    </w:p>
+    <w:p>
+      <w:r>
+        <w:t>##</w:t>
+      </w:r>
       <w:r>
         <w:t>An introduction to the problem or investigation</w:t>
       </w:r>
     </w:p>
+    <w:p/>
+    <w:p>
+      <w:r>
+        <w:t>For my NEA, I wish to create a virtual grimoire for the game</w:t>
+      </w:r>
+      <w:r>
+        <w:t>,</w:t>
+      </w:r>
+      <w:r>
+        <w:t xml:space="preserve"> Blood on the Clocktower</w:t>
+      </w:r>
+      <w:r>
+        <w:t>.</w:t>
+      </w:r>
+      <w:r>
+        <w:t xml:space="preserve"> The application will allow the user to assign roles to players, represented by circles and nametags, add “reminder tokens” and help them run the game by providing prompts of what to do.</w:t>
+      </w:r>
+    </w:p>
+    <w:p>
+      <w:r>
+        <w:t xml:space="preserve">It will be a potential replacement for the physical “grimoire” that comes with the game, pictured in </w:t>
+      </w:r>
+      <w:hyperlink w:anchor="_Physical_Grimoire" w:history="1">
+        <w:r>
+          <w:rPr>
+            <w:rStyle w:val="Hyperlink"/>
+          </w:rPr>
+          <w:t>Appendix 1.B</w:t>
+        </w:r>
+      </w:hyperlink>
+      <w:r>
+        <w:t>.</w:t>
+      </w:r>
+    </w:p>
+    <w:p>
+      <w:r>
+        <w:t xml:space="preserve">This application would be web-based and created using the </w:t>
+      </w:r>
+      <w:hyperlink r:id="rId12" w:history="1">
+        <w:r>
+          <w:rPr>
+            <w:rStyle w:val="Hyperlink"/>
+          </w:rPr>
+          <w:t>Godot Game Engine</w:t>
+        </w:r>
+      </w:hyperlink>
+      <w:r>
+        <w:t xml:space="preserve"> in </w:t>
+      </w:r>
+      <w:hyperlink r:id="rId13" w:history="1">
+        <w:proofErr w:type="spellStart"/>
+        <w:r>
+          <w:rPr>
+            <w:rStyle w:val="Hyperlink"/>
+          </w:rPr>
+          <w:t>GDScript</w:t>
+        </w:r>
+        <w:proofErr w:type="spellEnd"/>
+      </w:hyperlink>
+      <w:r>
+        <w:t xml:space="preserve"> (a </w:t>
+      </w:r>
+      <w:r>
+        <w:t xml:space="preserve">high-level </w:t>
+      </w:r>
+      <w:r>
+        <w:t xml:space="preserve">language </w:t>
+      </w:r>
+      <w:r>
+        <w:t>syntactically</w:t>
+      </w:r>
+      <w:r>
+        <w:t xml:space="preserve"> </w:t>
+      </w:r>
+      <w:r>
+        <w:t>similar to python)</w:t>
+      </w:r>
+      <w:r>
+        <w:t xml:space="preserve"> as it is very versatile and can export to my desired platform</w:t>
+      </w:r>
+      <w:r>
+        <w:t>, web</w:t>
+      </w:r>
+      <w:r>
+        <w:t>.</w:t>
+      </w:r>
+    </w:p>
     <w:p>
       <w:pPr>
         <w:pStyle w:val="Heading2"/>
       </w:pPr>
-      <w:bookmarkStart w:id="2" w:name="_Toc222835368"/>
+      <w:bookmarkStart w:id="6" w:name="_Toc224131417"/>
       <w:r>
         <w:t>Problem Outline</w:t>
       </w:r>
-      <w:bookmarkEnd w:id="2"/>
-    </w:p>
-    <w:p>
-      <w:r>
-        <w:t>Outline, who it’s being solved for</w:t>
+      <w:bookmarkEnd w:id="6"/>
+    </w:p>
+    <w:p>
+      <w:r>
+        <w:t>When playing, it can be difficult to transport all tokens to where the game is being played in a secure way and keep them in the grimoire while moving around. Additionally, if the storyteller wishes to use lots of characters, changing them can be difficult.</w:t>
+      </w:r>
+    </w:p>
+    <w:p>
+      <w:r>
+        <w:t xml:space="preserve">An online / virtual grimoire would eliminate these problems as it </w:t>
+      </w:r>
+      <w:r>
+        <w:t>drastically reduces the physical items needed, in some cases down to just a laptop or tablet.</w:t>
+      </w:r>
+    </w:p>
+    <w:p>
+      <w:r>
+        <w:t>Additionally, it would be able to help beginners by assisting them in what they need to do.</w:t>
+      </w:r>
+    </w:p>
+    <w:p>
+      <w:pPr>
+        <w:spacing w:after="160" w:line="259" w:lineRule="auto"/>
+      </w:pPr>
+      <w:r>
+        <w:br w:type="page"/>
       </w:r>
     </w:p>
     <w:p>
       <w:pPr>
         <w:pStyle w:val="Heading2"/>
       </w:pPr>
-      <w:bookmarkStart w:id="3" w:name="_Toc222835369"/>
-      <w:r>
-        <w:t>Background Description</w:t>
-      </w:r>
-      <w:bookmarkEnd w:id="3"/>
-    </w:p>
-    <w:p>
-      <w:r>
-        <w:t>Background of the problem in sufficient detail for a third party to understand the problem</w:t>
+      <w:bookmarkStart w:id="7" w:name="_Toc224131418"/>
+      <w:r>
+        <w:lastRenderedPageBreak/>
+        <w:t>Research</w:t>
+      </w:r>
+      <w:bookmarkEnd w:id="7"/>
+    </w:p>
+    <w:p>
+      <w:pPr>
+        <w:pStyle w:val="NoSpacing"/>
+      </w:pPr>
+      <w:r>
+        <w:t>##</w:t>
+      </w:r>
+    </w:p>
+    <w:p>
+      <w:pPr>
+        <w:pStyle w:val="NoSpacing"/>
+      </w:pPr>
+      <w:r>
+        <w:t>Provide research into the current problem that identifies other applications and comparisons to the current problem you are solving</w:t>
+      </w:r>
+    </w:p>
+    <w:p>
+      <w:pPr>
+        <w:pStyle w:val="NoSpacing"/>
+      </w:pPr>
+      <w:r>
+        <w:t>+ screenshots</w:t>
+      </w:r>
+    </w:p>
+    <w:p>
+      <w:pPr>
+        <w:pStyle w:val="NoSpacing"/>
+      </w:pPr>
+      <w:r>
+        <w:t>+ what makes them good</w:t>
+      </w:r>
+    </w:p>
+    <w:p>
+      <w:pPr>
+        <w:pStyle w:val="NoSpacing"/>
+      </w:pPr>
+      <w:r>
+        <w:t>+ what could be improved</w:t>
+      </w:r>
+    </w:p>
+    <w:p>
+      <w:r>
+        <w:t>##</w:t>
+      </w:r>
+    </w:p>
+    <w:p>
+      <w:pPr>
+        <w:pStyle w:val="Heading3"/>
+      </w:pPr>
+      <w:hyperlink r:id="rId14" w:history="1">
+        <w:bookmarkStart w:id="8" w:name="_Toc224131419"/>
+        <w:r>
+          <w:rPr>
+            <w:rStyle w:val="Hyperlink"/>
+          </w:rPr>
+          <w:t>clocktower.online</w:t>
+        </w:r>
+        <w:bookmarkEnd w:id="8"/>
+      </w:hyperlink>
+    </w:p>
+    <w:p>
+      <w:r>
+        <w:t>although this doesn’t strictly match the problem (as it is designed for fully online play) it is still a good example of a layout</w:t>
+      </w:r>
+    </w:p>
+    <w:p>
+      <w:pPr>
+        <w:pStyle w:val="Heading4"/>
+      </w:pPr>
+      <w:r>
+        <w:t>Advantages</w:t>
+      </w:r>
+    </w:p>
+    <w:p>
+      <w:pPr>
+        <w:pStyle w:val="ListParagraph"/>
+        <w:numPr>
+          <w:ilvl w:val="0"/>
+          <w:numId w:val="6"/>
+        </w:numPr>
+      </w:pPr>
+      <w:r>
+        <w:t>Works well</w:t>
+      </w:r>
+    </w:p>
+    <w:p>
+      <w:pPr>
+        <w:pStyle w:val="ListParagraph"/>
+        <w:numPr>
+          <w:ilvl w:val="0"/>
+          <w:numId w:val="6"/>
+        </w:numPr>
+      </w:pPr>
+      <w:r>
+        <w:t>Is semi-official</w:t>
+      </w:r>
+    </w:p>
+    <w:p>
+      <w:pPr>
+        <w:pStyle w:val="ListParagraph"/>
+        <w:numPr>
+          <w:ilvl w:val="0"/>
+          <w:numId w:val="6"/>
+        </w:numPr>
+      </w:pPr>
+      <w:r>
+        <w:t>Has capacity for random character assignment</w:t>
+      </w:r>
+    </w:p>
+    <w:p>
+      <w:pPr>
+        <w:pStyle w:val="ListParagraph"/>
+        <w:numPr>
+          <w:ilvl w:val="0"/>
+          <w:numId w:val="6"/>
+        </w:numPr>
+      </w:pPr>
+      <w:r>
+        <w:t>Has capacity for</w:t>
+      </w:r>
+      <w:r>
+        <w:t xml:space="preserve"> both</w:t>
+      </w:r>
+      <w:r>
+        <w:t xml:space="preserve"> custom and homebrew scripts</w:t>
+      </w:r>
+    </w:p>
+    <w:p>
+      <w:pPr>
+        <w:pStyle w:val="Heading4"/>
+      </w:pPr>
+      <w:r>
+        <w:t>Disadvantages</w:t>
+      </w:r>
+    </w:p>
+    <w:p>
+      <w:pPr>
+        <w:pStyle w:val="ListParagraph"/>
+        <w:numPr>
+          <w:ilvl w:val="0"/>
+          <w:numId w:val="6"/>
+        </w:numPr>
+      </w:pPr>
+      <w:r>
+        <w:t>Designed for playing online, not in-person</w:t>
+      </w:r>
+    </w:p>
+    <w:p>
+      <w:pPr>
+        <w:pStyle w:val="ListParagraph"/>
+        <w:numPr>
+          <w:ilvl w:val="0"/>
+          <w:numId w:val="6"/>
+        </w:numPr>
+      </w:pPr>
+      <w:r>
+        <w:t xml:space="preserve">It is no longer updated </w:t>
+      </w:r>
+      <w:r>
+        <w:t xml:space="preserve">(being replaced by </w:t>
+      </w:r>
+      <w:hyperlink w:anchor="_botc.app" w:history="1">
+        <w:r>
+          <w:rPr>
+            <w:rStyle w:val="Hyperlink"/>
+          </w:rPr>
+          <w:t>botc.app</w:t>
+        </w:r>
+      </w:hyperlink>
+      <w:r>
+        <w:t xml:space="preserve">) </w:t>
+      </w:r>
+      <w:r>
+        <w:t xml:space="preserve">so doesn’t have </w:t>
+      </w:r>
+      <w:r>
+        <w:t>newer characters</w:t>
+      </w:r>
+    </w:p>
+    <w:p>
+      <w:pPr>
+        <w:pStyle w:val="ListParagraph"/>
+        <w:numPr>
+          <w:ilvl w:val="0"/>
+          <w:numId w:val="6"/>
+        </w:numPr>
+      </w:pPr>
+      <w:r>
+        <w:t xml:space="preserve">Doesn’t allow for </w:t>
+      </w:r>
+      <w:r>
+        <w:t xml:space="preserve">the </w:t>
+      </w:r>
+      <w:r>
+        <w:t>free movement of tokens</w:t>
+      </w:r>
+    </w:p>
+    <w:p/>
+    <w:p>
+      <w:pPr>
+        <w:pStyle w:val="ImageCaption"/>
+      </w:pPr>
+      <w:r>
+        <w:t>clocktower.online viewed in Firefox 140.8.0esr (64-bit)</w:t>
+      </w:r>
+    </w:p>
+    <w:p>
+      <w:r>
+        <w:rPr>
+          <w:noProof/>
+        </w:rPr>
+        <w:drawing>
+          <wp:inline distT="0" distB="0" distL="0" distR="0" wp14:anchorId="670110D6" wp14:editId="2E317546">
+            <wp:extent cx="5731510" cy="2853690"/>
+            <wp:effectExtent l="0" t="0" r="2540" b="3810"/>
+            <wp:docPr id="5" name="Picture 5"/>
+            <wp:cNvGraphicFramePr>
+              <a:graphicFrameLocks xmlns:a="http://schemas.openxmlformats.org/drawingml/2006/main" noChangeAspect="1"/>
+            </wp:cNvGraphicFramePr>
+            <a:graphic xmlns:a="http://schemas.openxmlformats.org/drawingml/2006/main">
+              <a:graphicData uri="http://schemas.openxmlformats.org/drawingml/2006/picture">
+                <pic:pic xmlns:pic="http://schemas.openxmlformats.org/drawingml/2006/picture">
+                  <pic:nvPicPr>
+                    <pic:cNvPr id="1" name=""/>
+                    <pic:cNvPicPr/>
+                  </pic:nvPicPr>
+                  <pic:blipFill>
+                    <a:blip r:embed="rId15"/>
+                    <a:stretch>
+                      <a:fillRect/>
+                    </a:stretch>
+                  </pic:blipFill>
+                  <pic:spPr>
+                    <a:xfrm>
+                      <a:off x="0" y="0"/>
+                      <a:ext cx="5731510" cy="2853690"/>
+                    </a:xfrm>
+                    <a:prstGeom prst="rect">
+                      <a:avLst/>
+                    </a:prstGeom>
+                  </pic:spPr>
+                </pic:pic>
+              </a:graphicData>
+            </a:graphic>
+          </wp:inline>
+        </w:drawing>
+      </w:r>
+    </w:p>
+    <w:p>
+      <w:pPr>
+        <w:spacing w:after="160" w:line="259" w:lineRule="auto"/>
+      </w:pPr>
+      <w:r>
+        <w:br w:type="page"/>
+      </w:r>
+    </w:p>
+    <w:p>
+      <w:pPr>
+        <w:pStyle w:val="Heading3"/>
+      </w:pPr>
+      <w:hyperlink r:id="rId16" w:history="1">
+        <w:bookmarkStart w:id="9" w:name="_Toc224131420"/>
+        <w:r>
+          <w:rPr>
+            <w:rStyle w:val="Hyperlink"/>
+          </w:rPr>
+          <w:t>botc.games</w:t>
+        </w:r>
+        <w:bookmarkEnd w:id="9"/>
+      </w:hyperlink>
+    </w:p>
+    <w:p>
+      <w:pPr>
+        <w:pStyle w:val="Heading4"/>
+      </w:pPr>
+      <w:r>
+        <w:t>Advantages</w:t>
+      </w:r>
+    </w:p>
+    <w:p>
+      <w:pPr>
+        <w:pStyle w:val="ListParagraph"/>
+        <w:numPr>
+          <w:ilvl w:val="0"/>
+          <w:numId w:val="6"/>
+        </w:numPr>
+      </w:pPr>
+      <w:r>
+        <w:t>…</w:t>
+      </w:r>
+    </w:p>
+    <w:p>
+      <w:pPr>
+        <w:pStyle w:val="Heading4"/>
+      </w:pPr>
+      <w:r>
+        <w:t>Dis</w:t>
+      </w:r>
+      <w:r>
+        <w:t>advantages</w:t>
+      </w:r>
+    </w:p>
+    <w:p>
+      <w:pPr>
+        <w:pStyle w:val="ListParagraph"/>
+        <w:numPr>
+          <w:ilvl w:val="0"/>
+          <w:numId w:val="6"/>
+        </w:numPr>
+      </w:pPr>
+      <w:r>
+        <w:t>…</w:t>
+      </w:r>
+    </w:p>
+    <w:p/>
+    <w:p/>
+    <w:p>
+      <w:pPr>
+        <w:pStyle w:val="ImageCaption"/>
+      </w:pPr>
+      <w:r>
+        <w:t>botc.games viewed …?</w:t>
+      </w:r>
+    </w:p>
+    <w:p>
+      <w:pPr>
+        <w:spacing w:after="160" w:line="259" w:lineRule="auto"/>
+      </w:pPr>
+      <w:r>
+        <w:br w:type="page"/>
+      </w:r>
+    </w:p>
+    <w:p>
+      <w:pPr>
+        <w:pStyle w:val="Heading3"/>
+      </w:pPr>
+      <w:hyperlink r:id="rId17" w:history="1">
+        <w:bookmarkStart w:id="10" w:name="_Toc224131421"/>
+        <w:r>
+          <w:rPr>
+            <w:rStyle w:val="Hyperlink"/>
+          </w:rPr>
+          <w:t>grimmy.app</w:t>
+        </w:r>
+        <w:bookmarkEnd w:id="10"/>
+      </w:hyperlink>
+    </w:p>
+    <w:p>
+      <w:r>
+        <w:t>very similar to what I want to do :(</w:t>
+      </w:r>
+    </w:p>
+    <w:p>
+      <w:pPr>
+        <w:pStyle w:val="Heading4"/>
+      </w:pPr>
+      <w:r>
+        <w:t>Advantages</w:t>
+      </w:r>
+    </w:p>
+    <w:p>
+      <w:pPr>
+        <w:pStyle w:val="ListParagraph"/>
+        <w:numPr>
+          <w:ilvl w:val="0"/>
+          <w:numId w:val="6"/>
+        </w:numPr>
+      </w:pPr>
+      <w:r>
+        <w:t>Tokens can be moved around freely</w:t>
+      </w:r>
+    </w:p>
+    <w:p>
+      <w:pPr>
+        <w:pStyle w:val="ListParagraph"/>
+        <w:numPr>
+          <w:ilvl w:val="0"/>
+          <w:numId w:val="6"/>
+        </w:numPr>
+      </w:pPr>
+      <w:r>
+        <w:t xml:space="preserve">Has capacity for </w:t>
+      </w:r>
+      <w:r>
+        <w:t>custom scripts</w:t>
+      </w:r>
+    </w:p>
+    <w:p>
+      <w:pPr>
+        <w:pStyle w:val="ListParagraph"/>
+        <w:numPr>
+          <w:ilvl w:val="0"/>
+          <w:numId w:val="6"/>
+        </w:numPr>
+      </w:pPr>
+      <w:r>
+        <w:t>Simulates an actual grimoire very well</w:t>
+      </w:r>
+    </w:p>
+    <w:p>
+      <w:pPr>
+        <w:pStyle w:val="ListParagraph"/>
+        <w:numPr>
+          <w:ilvl w:val="0"/>
+          <w:numId w:val="6"/>
+        </w:numPr>
+      </w:pPr>
+      <w:r>
+        <w:t>Has night-time information cards</w:t>
+      </w:r>
+    </w:p>
+    <w:p>
+      <w:pPr>
+        <w:pStyle w:val="Heading4"/>
+      </w:pPr>
+      <w:r>
+        <w:t>Dis</w:t>
+      </w:r>
+      <w:r>
+        <w:t>advantages</w:t>
+      </w:r>
+    </w:p>
+    <w:p>
+      <w:pPr>
+        <w:pStyle w:val="ListParagraph"/>
+        <w:numPr>
+          <w:ilvl w:val="0"/>
+          <w:numId w:val="6"/>
+        </w:numPr>
+      </w:pPr>
+      <w:r>
+        <w:t>Does not support homebrew scripts / characters</w:t>
+      </w:r>
+    </w:p>
+    <w:p/>
+    <w:p/>
+    <w:p>
+      <w:pPr>
+        <w:pStyle w:val="ImageCaption"/>
+      </w:pPr>
+    </w:p>
+    <w:p>
+      <w:pPr>
+        <w:pStyle w:val="ImageCaption"/>
+      </w:pPr>
+      <w:r>
+        <w:t xml:space="preserve">A game of Blood on the Clocktower in </w:t>
+      </w:r>
+      <w:r>
+        <w:t>grimmy.app</w:t>
+      </w:r>
+      <w:r>
+        <w:t xml:space="preserve"> </w:t>
+      </w:r>
+      <w:r>
+        <w:t>o</w:t>
+      </w:r>
+      <w:r>
+        <w:t xml:space="preserve">n </w:t>
+      </w:r>
+      <w:r>
+        <w:t xml:space="preserve">Firefox </w:t>
+      </w:r>
+      <w:r>
+        <w:t>140.8.0esr (64-bit</w:t>
+      </w:r>
+      <w:r>
+        <w:t>)</w:t>
+      </w:r>
+    </w:p>
+    <w:p>
+      <w:pPr>
+        <w:pStyle w:val="ImageCaption"/>
+      </w:pPr>
+      <w:r>
+        <w:rPr>
+          <w:noProof/>
+        </w:rPr>
+        <w:drawing>
+          <wp:inline distT="0" distB="0" distL="0" distR="0" wp14:anchorId="234B6033" wp14:editId="563D38E4">
+            <wp:extent cx="5731510" cy="4633595"/>
+            <wp:effectExtent l="0" t="0" r="2540" b="0"/>
+            <wp:docPr id="6" name="Picture 6"/>
+            <wp:cNvGraphicFramePr>
+              <a:graphicFrameLocks xmlns:a="http://schemas.openxmlformats.org/drawingml/2006/main" noChangeAspect="1"/>
+            </wp:cNvGraphicFramePr>
+            <a:graphic xmlns:a="http://schemas.openxmlformats.org/drawingml/2006/main">
+              <a:graphicData uri="http://schemas.openxmlformats.org/drawingml/2006/picture">
+                <pic:pic xmlns:pic="http://schemas.openxmlformats.org/drawingml/2006/picture">
+                  <pic:nvPicPr>
+                    <pic:cNvPr id="1" name=""/>
+                    <pic:cNvPicPr/>
+                  </pic:nvPicPr>
+                  <pic:blipFill>
+                    <a:blip r:embed="rId18"/>
+                    <a:stretch>
+                      <a:fillRect/>
+                    </a:stretch>
+                  </pic:blipFill>
+                  <pic:spPr>
+                    <a:xfrm>
+                      <a:off x="0" y="0"/>
+                      <a:ext cx="5731510" cy="4633595"/>
+                    </a:xfrm>
+                    <a:prstGeom prst="rect">
+                      <a:avLst/>
+                    </a:prstGeom>
+                  </pic:spPr>
+                </pic:pic>
+              </a:graphicData>
+            </a:graphic>
+          </wp:inline>
+        </w:drawing>
+      </w:r>
+      <w:r>
+        <w:br w:type="page"/>
+      </w:r>
+    </w:p>
+    <w:p>
+      <w:pPr>
+        <w:pStyle w:val="Heading3"/>
+      </w:pPr>
+      <w:hyperlink r:id="rId19" w:history="1">
+        <w:bookmarkStart w:id="11" w:name="_Toc224131422"/>
+        <w:r>
+          <w:rPr>
+            <w:rStyle w:val="Hyperlink"/>
+            <w:color w:val="0F4761" w:themeColor="accent1" w:themeShade="BF"/>
+            <w:u w:val="none"/>
+          </w:rPr>
+          <w:t>Pocket Grimoire</w:t>
+        </w:r>
+        <w:bookmarkEnd w:id="11"/>
+      </w:hyperlink>
+    </w:p>
+    <w:p>
+      <w:pPr>
+        <w:pStyle w:val="Heading4"/>
+      </w:pPr>
+      <w:r>
+        <w:t>Advantages</w:t>
+      </w:r>
+    </w:p>
+    <w:p>
+      <w:pPr>
+        <w:pStyle w:val="ListParagraph"/>
+        <w:numPr>
+          <w:ilvl w:val="0"/>
+          <w:numId w:val="6"/>
+        </w:numPr>
+      </w:pPr>
+      <w:r>
+        <w:t>Has capacity for both custom and homebrew scripts</w:t>
+      </w:r>
+    </w:p>
+    <w:p>
+      <w:pPr>
+        <w:pStyle w:val="ListParagraph"/>
+        <w:numPr>
+          <w:ilvl w:val="0"/>
+          <w:numId w:val="6"/>
+        </w:numPr>
+      </w:pPr>
+      <w:r>
+        <w:t>Simulates the in-person experience very accurately</w:t>
+      </w:r>
+    </w:p>
+    <w:p>
+      <w:pPr>
+        <w:pStyle w:val="ListParagraph"/>
+        <w:numPr>
+          <w:ilvl w:val="0"/>
+          <w:numId w:val="6"/>
+        </w:numPr>
+      </w:pPr>
+      <w:r>
+        <w:t>Has night-time information cards</w:t>
+      </w:r>
+    </w:p>
+    <w:p>
+      <w:pPr>
+        <w:pStyle w:val="Heading4"/>
+      </w:pPr>
+      <w:r>
+        <w:t>Dis</w:t>
+      </w:r>
+      <w:r>
+        <w:t>a</w:t>
+      </w:r>
+      <w:r>
+        <w:t>dvantages</w:t>
+      </w:r>
+    </w:p>
+    <w:p>
+      <w:pPr>
+        <w:pStyle w:val="ListParagraph"/>
+        <w:numPr>
+          <w:ilvl w:val="0"/>
+          <w:numId w:val="6"/>
+        </w:numPr>
+      </w:pPr>
+      <w:r>
+        <w:t>Not very user-friendly</w:t>
+      </w:r>
+    </w:p>
+    <w:p/>
+    <w:p>
+      <w:pPr>
+        <w:pStyle w:val="ImageCaption"/>
+      </w:pPr>
+      <w:r>
+        <w:t>A game of Blood on the Clocktower in t</w:t>
+      </w:r>
+      <w:r>
+        <w:t xml:space="preserve">he “Grimoire” tab of Pocket Grimoire on Firefox </w:t>
+      </w:r>
+      <w:r>
+        <w:t>140.8.0esr (64-bit</w:t>
+      </w:r>
+      <w:r>
+        <w:t>)</w:t>
+      </w:r>
+    </w:p>
+    <w:p>
+      <w:r>
+        <w:rPr>
+          <w:noProof/>
+        </w:rPr>
+        <w:drawing>
+          <wp:inline distT="0" distB="0" distL="0" distR="0" wp14:anchorId="5BFAA305" wp14:editId="48E3D62E">
+            <wp:extent cx="5731510" cy="4596765"/>
+            <wp:effectExtent l="0" t="0" r="2540" b="0"/>
+            <wp:docPr id="8" name="Picture 8"/>
+            <wp:cNvGraphicFramePr>
+              <a:graphicFrameLocks xmlns:a="http://schemas.openxmlformats.org/drawingml/2006/main" noChangeAspect="1"/>
+            </wp:cNvGraphicFramePr>
+            <a:graphic xmlns:a="http://schemas.openxmlformats.org/drawingml/2006/main">
+              <a:graphicData uri="http://schemas.openxmlformats.org/drawingml/2006/picture">
+                <pic:pic xmlns:pic="http://schemas.openxmlformats.org/drawingml/2006/picture">
+                  <pic:nvPicPr>
+                    <pic:cNvPr id="1" name=""/>
+                    <pic:cNvPicPr/>
+                  </pic:nvPicPr>
+                  <pic:blipFill>
+                    <a:blip r:embed="rId20"/>
+                    <a:stretch>
+                      <a:fillRect/>
+                    </a:stretch>
+                  </pic:blipFill>
+                  <pic:spPr>
+                    <a:xfrm>
+                      <a:off x="0" y="0"/>
+                      <a:ext cx="5731510" cy="4596765"/>
+                    </a:xfrm>
+                    <a:prstGeom prst="rect">
+                      <a:avLst/>
+                    </a:prstGeom>
+                  </pic:spPr>
+                </pic:pic>
+              </a:graphicData>
+            </a:graphic>
+          </wp:inline>
+        </w:drawing>
+      </w:r>
+      <w:r>
+        <w:br w:type="page"/>
+      </w:r>
+    </w:p>
+    <w:p>
+      <w:pPr>
+        <w:pStyle w:val="Heading3"/>
+      </w:pPr>
+      <w:hyperlink r:id="rId21" w:history="1">
+        <w:bookmarkStart w:id="12" w:name="_Toc224131423"/>
+        <w:r>
+          <w:rPr>
+            <w:rStyle w:val="Hyperlink"/>
+          </w:rPr>
+          <w:t>the-grim.netlify.app</w:t>
+        </w:r>
+        <w:bookmarkEnd w:id="12"/>
+      </w:hyperlink>
+    </w:p>
+    <w:p>
+      <w:pPr>
+        <w:pStyle w:val="Heading4"/>
+      </w:pPr>
+      <w:r>
+        <w:t>Advantages</w:t>
+      </w:r>
+    </w:p>
+    <w:p>
+      <w:pPr>
+        <w:pStyle w:val="ListParagraph"/>
+        <w:numPr>
+          <w:ilvl w:val="0"/>
+          <w:numId w:val="6"/>
+        </w:numPr>
+      </w:pPr>
+      <w:r>
+        <w:t xml:space="preserve">Very </w:t>
+      </w:r>
+      <w:r>
+        <w:t>easy to use</w:t>
+      </w:r>
+    </w:p>
+    <w:p>
+      <w:pPr>
+        <w:pStyle w:val="ListParagraph"/>
+        <w:numPr>
+          <w:ilvl w:val="0"/>
+          <w:numId w:val="6"/>
+        </w:numPr>
+      </w:pPr>
+      <w:r>
+        <w:t>Has helpful steps in guiding the setup of a game</w:t>
+      </w:r>
+    </w:p>
+    <w:p>
+      <w:pPr>
+        <w:pStyle w:val="Heading4"/>
+      </w:pPr>
+      <w:r>
+        <w:t>Dis</w:t>
+      </w:r>
+      <w:r>
+        <w:t>a</w:t>
+      </w:r>
+      <w:r>
+        <w:t>dvantages</w:t>
+      </w:r>
+    </w:p>
+    <w:p>
+      <w:pPr>
+        <w:pStyle w:val="ListParagraph"/>
+        <w:numPr>
+          <w:ilvl w:val="0"/>
+          <w:numId w:val="6"/>
+        </w:numPr>
+      </w:pPr>
+      <w:r>
+        <w:t>Doesn’t allow for the free movement of tokens</w:t>
+      </w:r>
+    </w:p>
+    <w:p/>
+    <w:p>
+      <w:pPr>
+        <w:pStyle w:val="ImageCaption"/>
+      </w:pPr>
+      <w:r>
+        <w:t xml:space="preserve">A game of Blood on the Clocktower in The-grim.netlify.app on Firefox </w:t>
+      </w:r>
+      <w:r>
+        <w:t>140.8.0esr (64-bit</w:t>
+      </w:r>
+      <w:r>
+        <w:t>)</w:t>
+      </w:r>
+    </w:p>
+    <w:p>
+      <w:pPr>
+        <w:pStyle w:val="ImageCaption"/>
+      </w:pPr>
+      <w:r>
+        <w:rPr>
+          <w:noProof/>
+          <w14:ligatures w14:val="standardContextual"/>
+        </w:rPr>
+        <w:drawing>
+          <wp:inline distT="0" distB="0" distL="0" distR="0" wp14:anchorId="238383E4" wp14:editId="13233E27">
+            <wp:extent cx="5731510" cy="5117465"/>
+            <wp:effectExtent l="0" t="0" r="2540" b="6985"/>
+            <wp:docPr id="9" name="Picture 9"/>
+            <wp:cNvGraphicFramePr>
+              <a:graphicFrameLocks xmlns:a="http://schemas.openxmlformats.org/drawingml/2006/main" noChangeAspect="1"/>
+            </wp:cNvGraphicFramePr>
+            <a:graphic xmlns:a="http://schemas.openxmlformats.org/drawingml/2006/main">
+              <a:graphicData uri="http://schemas.openxmlformats.org/drawingml/2006/picture">
+                <pic:pic xmlns:pic="http://schemas.openxmlformats.org/drawingml/2006/picture">
+                  <pic:nvPicPr>
+                    <pic:cNvPr id="1" name=""/>
+                    <pic:cNvPicPr/>
+                  </pic:nvPicPr>
+                  <pic:blipFill>
+                    <a:blip r:embed="rId22"/>
+                    <a:stretch>
+                      <a:fillRect/>
+                    </a:stretch>
+                  </pic:blipFill>
+                  <pic:spPr>
+                    <a:xfrm>
+                      <a:off x="0" y="0"/>
+                      <a:ext cx="5731510" cy="5117465"/>
+                    </a:xfrm>
+                    <a:prstGeom prst="rect">
+                      <a:avLst/>
+                    </a:prstGeom>
+                  </pic:spPr>
+                </pic:pic>
+              </a:graphicData>
+            </a:graphic>
+          </wp:inline>
+        </w:drawing>
+      </w:r>
+    </w:p>
+    <w:p>
+      <w:pPr>
+        <w:spacing w:after="160" w:line="259" w:lineRule="auto"/>
+      </w:pPr>
+      <w:r>
+        <w:br w:type="page"/>
+      </w:r>
+    </w:p>
+    <w:bookmarkStart w:id="13" w:name="_botc.app"/>
+    <w:bookmarkEnd w:id="13"/>
+    <w:p>
+      <w:pPr>
+        <w:pStyle w:val="Heading3"/>
+      </w:pPr>
+      <w:r>
+        <w:lastRenderedPageBreak/>
+        <w:fldChar w:fldCharType="begin"/>
+      </w:r>
+      <w:r>
+        <w:instrText xml:space="preserve"> HYPERLINK "https://botc.app" </w:instrText>
+      </w:r>
+      <w:r>
+        <w:fldChar w:fldCharType="separate"/>
+      </w:r>
+      <w:bookmarkStart w:id="14" w:name="_Toc224131424"/>
+      <w:r>
+        <w:rPr>
+          <w:rStyle w:val="Hyperlink"/>
+        </w:rPr>
+        <w:t>botc.app</w:t>
+      </w:r>
+      <w:bookmarkEnd w:id="14"/>
+      <w:r>
+        <w:fldChar w:fldCharType="end"/>
+      </w:r>
+    </w:p>
+    <w:p>
+      <w:pPr>
+        <w:pStyle w:val="Heading4"/>
+      </w:pPr>
+      <w:r>
+        <w:t>Advantages</w:t>
+      </w:r>
+    </w:p>
+    <w:p>
+      <w:pPr>
+        <w:pStyle w:val="ListParagraph"/>
+        <w:numPr>
+          <w:ilvl w:val="0"/>
+          <w:numId w:val="6"/>
+        </w:numPr>
+      </w:pPr>
+      <w:r>
+        <w:t>Official</w:t>
+      </w:r>
+    </w:p>
+    <w:p>
+      <w:pPr>
+        <w:pStyle w:val="ListParagraph"/>
+        <w:numPr>
+          <w:ilvl w:val="0"/>
+          <w:numId w:val="6"/>
+        </w:numPr>
+      </w:pPr>
+      <w:r>
+        <w:t>Has support for both custom and homebrew scripts</w:t>
+      </w:r>
+    </w:p>
+    <w:p>
+      <w:pPr>
+        <w:pStyle w:val="Heading4"/>
+      </w:pPr>
+      <w:r>
+        <w:t>Dis</w:t>
+      </w:r>
+      <w:r>
+        <w:t>a</w:t>
+      </w:r>
+      <w:r>
+        <w:t>dvantages</w:t>
+      </w:r>
+    </w:p>
+    <w:p>
+      <w:pPr>
+        <w:pStyle w:val="ListParagraph"/>
+        <w:numPr>
+          <w:ilvl w:val="0"/>
+          <w:numId w:val="6"/>
+        </w:numPr>
+      </w:pPr>
+      <w:r>
+        <w:t>Mainly Designed for online play</w:t>
+      </w:r>
+    </w:p>
+    <w:p>
+      <w:pPr>
+        <w:pStyle w:val="ListParagraph"/>
+        <w:numPr>
+          <w:ilvl w:val="0"/>
+          <w:numId w:val="6"/>
+        </w:numPr>
+      </w:pPr>
+      <w:r>
+        <w:t>Doesn’t allow for the free movement of tokens</w:t>
+      </w:r>
+    </w:p>
+    <w:p>
+      <w:pPr>
+        <w:spacing w:after="160" w:line="259" w:lineRule="auto"/>
+      </w:pPr>
+      <w:r>
+        <w:br w:type="page"/>
       </w:r>
     </w:p>
     <w:p>
       <w:pPr>
         <w:pStyle w:val="Heading2"/>
       </w:pPr>
-      <w:bookmarkStart w:id="4" w:name="_Toc222835370"/>
-      <w:r>
-        <w:t>Research</w:t>
-      </w:r>
-      <w:bookmarkEnd w:id="4"/>
-    </w:p>
-    <w:p>
-      <w:pPr>
-        <w:pStyle w:val="NoSpacing"/>
-      </w:pPr>
-      <w:r>
-        <w:t>Provide research into the current problem that identifies other applications and comparisons to the current problem you are solving</w:t>
-      </w:r>
-    </w:p>
-    <w:p>
-      <w:pPr>
-        <w:pStyle w:val="NoSpacing"/>
-      </w:pPr>
-      <w:r>
-        <w:t>+ screenshots</w:t>
-      </w:r>
-    </w:p>
-    <w:p>
-      <w:pPr>
-        <w:pStyle w:val="NoSpacing"/>
-      </w:pPr>
-      <w:r>
-        <w:t>+ what makes them good</w:t>
-      </w:r>
-    </w:p>
-    <w:p>
-      <w:pPr>
-        <w:pStyle w:val="NoSpacing"/>
-      </w:pPr>
-      <w:r>
-        <w:t>+ what could be improved</w:t>
+      <w:bookmarkStart w:id="15" w:name="_Toc224131425"/>
+      <w:r>
+        <w:lastRenderedPageBreak/>
+        <w:t>Survey / Questionnaire / Interview</w:t>
+      </w:r>
+      <w:bookmarkEnd w:id="15"/>
+    </w:p>
+    <w:p>
+      <w:r>
+        <w:t xml:space="preserve">## </w:t>
+      </w:r>
+      <w:r>
+        <w:t xml:space="preserve">Detailed and </w:t>
+      </w:r>
+      <w:proofErr w:type="spellStart"/>
+      <w:r>
+        <w:t>analysed</w:t>
+      </w:r>
+      <w:proofErr w:type="spellEnd"/>
+      <w:r>
+        <w:t xml:space="preserve"> with annotated charts where applicable</w:t>
+      </w:r>
+    </w:p>
+    <w:p>
+      <w:r>
+        <w:t>In order to create criteria for this project, I will be interviewing my friend (PJ), who plays Blood on the Clocktower, to see what features he would want in an application like this one.</w:t>
+      </w:r>
+    </w:p>
+    <w:p/>
+    <w:p>
+      <w:r>
+        <w:t xml:space="preserve">Full Interview can be found in </w:t>
+      </w:r>
+      <w:hyperlink w:anchor="_Full_Interview" w:history="1">
+        <w:r>
+          <w:rPr>
+            <w:rStyle w:val="Hyperlink"/>
+          </w:rPr>
+          <w:t>Appendix 3</w:t>
+        </w:r>
+      </w:hyperlink>
+    </w:p>
+    <w:p>
+      <w:pPr>
+        <w:pStyle w:val="Heading3"/>
+      </w:pPr>
+      <w:bookmarkStart w:id="16" w:name="_Toc224131426"/>
+      <w:r>
+        <w:t>Summary</w:t>
+      </w:r>
+      <w:bookmarkEnd w:id="16"/>
+    </w:p>
+    <w:p>
+      <w:r>
+        <w:t>…</w:t>
       </w:r>
     </w:p>
     <w:p>
       <w:pPr>
         <w:pStyle w:val="Heading2"/>
       </w:pPr>
-      <w:bookmarkStart w:id="5" w:name="_Toc222835371"/>
-      <w:r>
-        <w:t>Survey / Questionnaire / Interview</w:t>
-      </w:r>
-      <w:bookmarkEnd w:id="5"/>
-    </w:p>
-    <w:p>
-      <w:r>
-        <w:t xml:space="preserve">Detailed and </w:t>
-      </w:r>
-      <w:proofErr w:type="spellStart"/>
-      <w:r>
-        <w:t>analysed</w:t>
-      </w:r>
-      <w:proofErr w:type="spellEnd"/>
-      <w:r>
-        <w:t xml:space="preserve"> with annotated charts where applicable</w:t>
+      <w:bookmarkStart w:id="17" w:name="_Toc224131427"/>
+      <w:r>
+        <w:t>Objectives</w:t>
+      </w:r>
+      <w:bookmarkEnd w:id="17"/>
+    </w:p>
+    <w:p>
+      <w:r>
+        <w:t>Numbered list of measurable specific objectives covering all required functionality of the solution or areas of investigation</w:t>
       </w:r>
     </w:p>
     <w:p>
       <w:pPr>
         <w:pStyle w:val="Heading2"/>
       </w:pPr>
-      <w:bookmarkStart w:id="6" w:name="_Toc222835372"/>
-      <w:r>
-        <w:t>Objectives</w:t>
-      </w:r>
-      <w:bookmarkEnd w:id="6"/>
-    </w:p>
-    <w:p>
-      <w:r>
-        <w:t>Numbered list of measurable specific objectives covering all required functionality of the solution or areas of investigation</w:t>
+      <w:bookmarkStart w:id="18" w:name="_Toc224131428"/>
+      <w:r>
+        <w:t>Success Criteria</w:t>
+      </w:r>
+      <w:bookmarkEnd w:id="18"/>
+    </w:p>
+    <w:p>
+      <w:r>
+        <w:t>Absolute minimum needed</w:t>
       </w:r>
     </w:p>
     <w:p>
       <w:pPr>
         <w:pStyle w:val="Heading2"/>
       </w:pPr>
-      <w:bookmarkStart w:id="7" w:name="_Toc222835373"/>
-      <w:r>
-        <w:t>Success Criteria</w:t>
-      </w:r>
-      <w:bookmarkEnd w:id="7"/>
-    </w:p>
-    <w:p>
-      <w:r>
-        <w:t>Absolute minimum needed</w:t>
-      </w:r>
-    </w:p>
-    <w:p>
-      <w:pPr>
-        <w:pStyle w:val="Heading2"/>
-      </w:pPr>
-      <w:bookmarkStart w:id="8" w:name="_Toc222835374"/>
+      <w:bookmarkStart w:id="19" w:name="_Toc224131429"/>
       <w:r>
         <w:t xml:space="preserve">Modelling of </w:t>
       </w:r>
       <w:r>
         <w:t>the Problem</w:t>
       </w:r>
-      <w:bookmarkEnd w:id="8"/>
+      <w:bookmarkEnd w:id="19"/>
     </w:p>
     <w:p>
       <w:r>
@@ -2539,12 +4385,20 @@
       <w:pPr>
         <w:pStyle w:val="Heading1"/>
       </w:pPr>
-      <w:bookmarkStart w:id="9" w:name="_Toc222835375"/>
+      <w:bookmarkStart w:id="20" w:name="_Toc224131430"/>
       <w:r>
         <w:lastRenderedPageBreak/>
         <w:t>Design</w:t>
       </w:r>
-      <w:bookmarkEnd w:id="9"/>
+      <w:bookmarkEnd w:id="20"/>
+    </w:p>
+    <w:p>
+      <w:pPr>
+        <w:pStyle w:val="NoSpacing"/>
+      </w:pPr>
+      <w:r>
+        <w:t>##</w:t>
+      </w:r>
     </w:p>
     <w:p>
       <w:pPr>
@@ -2753,6 +4607,9 @@
         <w:spacing w:after="160" w:line="259" w:lineRule="auto"/>
       </w:pPr>
       <w:r>
+        <w:t>##</w:t>
+      </w:r>
+      <w:r>
         <w:br w:type="page"/>
       </w:r>
     </w:p>
@@ -2760,12 +4617,17 @@
       <w:pPr>
         <w:pStyle w:val="Heading1"/>
       </w:pPr>
-      <w:bookmarkStart w:id="10" w:name="_Toc222835376"/>
+      <w:bookmarkStart w:id="21" w:name="_Toc224131431"/>
       <w:r>
         <w:lastRenderedPageBreak/>
         <w:t>Technical Solution</w:t>
       </w:r>
-      <w:bookmarkEnd w:id="10"/>
+      <w:bookmarkEnd w:id="21"/>
+    </w:p>
+    <w:p>
+      <w:r>
+        <w:t>##</w:t>
+      </w:r>
     </w:p>
     <w:p>
       <w:r>
@@ -2786,6 +4648,9 @@
       <w:r>
         <w:t>S</w:t>
       </w:r>
+      <w:r>
+        <w:t xml:space="preserve"> and links to appendix</w:t>
+      </w:r>
     </w:p>
     <w:p>
       <w:pPr>
@@ -2800,6 +4665,9 @@
         <w:spacing w:after="160" w:line="259" w:lineRule="auto"/>
       </w:pPr>
       <w:r>
+        <w:t>##</w:t>
+      </w:r>
+      <w:r>
         <w:br w:type="page"/>
       </w:r>
     </w:p>
@@ -2807,14 +4675,19 @@
       <w:pPr>
         <w:pStyle w:val="Heading1"/>
       </w:pPr>
-      <w:bookmarkStart w:id="11" w:name="_Final_Testing"/>
-      <w:bookmarkStart w:id="12" w:name="_Toc222835377"/>
-      <w:bookmarkEnd w:id="11"/>
+      <w:bookmarkStart w:id="22" w:name="_Final_Testing"/>
+      <w:bookmarkStart w:id="23" w:name="_Toc224131432"/>
+      <w:bookmarkEnd w:id="22"/>
       <w:r>
         <w:lastRenderedPageBreak/>
         <w:t>Final Testing</w:t>
       </w:r>
-      <w:bookmarkEnd w:id="12"/>
+      <w:bookmarkEnd w:id="23"/>
+    </w:p>
+    <w:p>
+      <w:r>
+        <w:t>##</w:t>
+      </w:r>
     </w:p>
     <w:tbl>
       <w:tblPr>
@@ -2998,16 +4871,8 @@
                 <w:rPr>
                   <w:rStyle w:val="Hyperlink"/>
                 </w:rPr>
-                <w:t xml:space="preserve">Appendix </w:t>
+                <w:t>Appendix 4.A</w:t>
               </w:r>
-              <w:proofErr w:type="gramStart"/>
-              <w:r>
-                <w:rPr>
-                  <w:rStyle w:val="Hyperlink"/>
-                </w:rPr>
-                <w:t>3.A</w:t>
-              </w:r>
-              <w:proofErr w:type="gramEnd"/>
             </w:hyperlink>
           </w:p>
         </w:tc>
@@ -3086,16 +4951,8 @@
                 <w:rPr>
                   <w:rStyle w:val="Hyperlink"/>
                 </w:rPr>
-                <w:t xml:space="preserve">Appendix </w:t>
+                <w:t>Appendix 4.B</w:t>
               </w:r>
-              <w:proofErr w:type="gramStart"/>
-              <w:r>
-                <w:rPr>
-                  <w:rStyle w:val="Hyperlink"/>
-                </w:rPr>
-                <w:t>3.B</w:t>
-              </w:r>
-              <w:proofErr w:type="gramEnd"/>
             </w:hyperlink>
           </w:p>
         </w:tc>
@@ -3106,6 +4963,9 @@
         <w:spacing w:after="160" w:line="259" w:lineRule="auto"/>
       </w:pPr>
       <w:r>
+        <w:t>##</w:t>
+      </w:r>
+      <w:r>
         <w:br w:type="page"/>
       </w:r>
     </w:p>
@@ -3113,12 +4973,17 @@
       <w:pPr>
         <w:pStyle w:val="Heading1"/>
       </w:pPr>
-      <w:bookmarkStart w:id="13" w:name="_Toc222835378"/>
+      <w:bookmarkStart w:id="24" w:name="_Toc224131433"/>
       <w:r>
         <w:lastRenderedPageBreak/>
         <w:t>Evaluation</w:t>
       </w:r>
-      <w:bookmarkEnd w:id="13"/>
+      <w:bookmarkEnd w:id="24"/>
+    </w:p>
+    <w:p>
+      <w:r>
+        <w:t>##</w:t>
+      </w:r>
     </w:p>
     <w:p>
       <w:r>
@@ -3140,7 +5005,11 @@
         <w:t>Future Improvements</w:t>
       </w:r>
     </w:p>
-    <w:p/>
+    <w:p>
+      <w:r>
+        <w:t>##</w:t>
+      </w:r>
+    </w:p>
     <w:p>
       <w:pPr>
         <w:spacing w:after="160" w:line="259" w:lineRule="auto"/>
@@ -3153,12 +5022,12 @@
       <w:pPr>
         <w:pStyle w:val="Heading1"/>
       </w:pPr>
-      <w:bookmarkStart w:id="14" w:name="_Toc222835379"/>
+      <w:bookmarkStart w:id="25" w:name="_Toc224131434"/>
       <w:r>
         <w:lastRenderedPageBreak/>
         <w:t>Appendix</w:t>
       </w:r>
-      <w:bookmarkEnd w:id="14"/>
+      <w:bookmarkEnd w:id="25"/>
     </w:p>
     <w:p>
       <w:pPr>
@@ -3168,11 +5037,210 @@
           <w:numId w:val="1"/>
         </w:numPr>
       </w:pPr>
-      <w:bookmarkStart w:id="15" w:name="_Toc222835380"/>
-      <w:r>
-        <w:t>Code</w:t>
-      </w:r>
-      <w:bookmarkEnd w:id="15"/>
+      <w:bookmarkStart w:id="26" w:name="_Toc224131435"/>
+      <w:r>
+        <w:t xml:space="preserve">Additional </w:t>
+      </w:r>
+      <w:r>
+        <w:t>Images</w:t>
+      </w:r>
+      <w:bookmarkEnd w:id="26"/>
+    </w:p>
+    <w:p>
+      <w:pPr>
+        <w:pStyle w:val="Heading3"/>
+        <w:numPr>
+          <w:ilvl w:val="0"/>
+          <w:numId w:val="4"/>
+        </w:numPr>
+      </w:pPr>
+      <w:bookmarkStart w:id="27" w:name="_Physical_Grimoire"/>
+      <w:bookmarkStart w:id="28" w:name="_Toc224131436"/>
+      <w:bookmarkEnd w:id="27"/>
+      <w:r>
+        <w:t>Trouble Brewing</w:t>
+      </w:r>
+      <w:bookmarkEnd w:id="28"/>
+    </w:p>
+    <w:p>
+      <w:pPr>
+        <w:ind w:firstLine="720"/>
+      </w:pPr>
+      <w:r>
+        <w:rPr>
+          <w:noProof/>
+        </w:rPr>
+        <w:drawing>
+          <wp:inline distT="0" distB="0" distL="0" distR="0" wp14:anchorId="668E098A" wp14:editId="5C2A811A">
+            <wp:extent cx="4248150" cy="6001347"/>
+            <wp:effectExtent l="0" t="0" r="0" b="0"/>
+            <wp:docPr id="4" name="Picture 4"/>
+            <wp:cNvGraphicFramePr>
+              <a:graphicFrameLocks xmlns:a="http://schemas.openxmlformats.org/drawingml/2006/main" noChangeAspect="1"/>
+            </wp:cNvGraphicFramePr>
+            <a:graphic xmlns:a="http://schemas.openxmlformats.org/drawingml/2006/main">
+              <a:graphicData uri="http://schemas.openxmlformats.org/drawingml/2006/picture">
+                <pic:pic xmlns:pic="http://schemas.openxmlformats.org/drawingml/2006/picture">
+                  <pic:nvPicPr>
+                    <pic:cNvPr id="0" name="Picture 1"/>
+                    <pic:cNvPicPr>
+                      <a:picLocks noChangeAspect="1" noChangeArrowheads="1"/>
+                    </pic:cNvPicPr>
+                  </pic:nvPicPr>
+                  <pic:blipFill>
+                    <a:blip r:embed="rId23" cstate="print">
+                      <a:extLst>
+                        <a:ext uri="{28A0092B-C50C-407E-A947-70E740481C1C}">
+                          <a14:useLocalDpi xmlns:a14="http://schemas.microsoft.com/office/drawing/2010/main" val="0"/>
+                        </a:ext>
+                      </a:extLst>
+                    </a:blip>
+                    <a:srcRect/>
+                    <a:stretch>
+                      <a:fillRect/>
+                    </a:stretch>
+                  </pic:blipFill>
+                  <pic:spPr bwMode="auto">
+                    <a:xfrm>
+                      <a:off x="0" y="0"/>
+                      <a:ext cx="4258609" cy="6016122"/>
+                    </a:xfrm>
+                    <a:prstGeom prst="rect">
+                      <a:avLst/>
+                    </a:prstGeom>
+                    <a:noFill/>
+                    <a:ln>
+                      <a:noFill/>
+                    </a:ln>
+                  </pic:spPr>
+                </pic:pic>
+              </a:graphicData>
+            </a:graphic>
+          </wp:inline>
+        </w:drawing>
+      </w:r>
+    </w:p>
+    <w:p>
+      <w:pPr>
+        <w:ind w:left="720"/>
+        <w:rPr>
+          <w:rStyle w:val="Hyperlink"/>
+        </w:rPr>
+      </w:pPr>
+      <w:hyperlink w:anchor="_Background_Description" w:history="1">
+        <w:r>
+          <w:rPr>
+            <w:rStyle w:val="Hyperlink"/>
+          </w:rPr>
+          <w:t>Back to Background Description</w:t>
+        </w:r>
+      </w:hyperlink>
+      <w:bookmarkStart w:id="29" w:name="_Trouble_Brewing"/>
+      <w:bookmarkEnd w:id="29"/>
+    </w:p>
+    <w:p>
+      <w:pPr>
+        <w:spacing w:after="160" w:line="259" w:lineRule="auto"/>
+        <w:rPr>
+          <w:color w:val="467886" w:themeColor="hyperlink"/>
+          <w:u w:val="single"/>
+        </w:rPr>
+      </w:pPr>
+      <w:r>
+        <w:rPr>
+          <w:rStyle w:val="Hyperlink"/>
+        </w:rPr>
+        <w:br w:type="page"/>
+      </w:r>
+    </w:p>
+    <w:p>
+      <w:pPr>
+        <w:pStyle w:val="Heading3"/>
+        <w:numPr>
+          <w:ilvl w:val="0"/>
+          <w:numId w:val="4"/>
+        </w:numPr>
+      </w:pPr>
+      <w:bookmarkStart w:id="30" w:name="_Toc224131437"/>
+      <w:r>
+        <w:lastRenderedPageBreak/>
+        <w:t>Physical Grimoire</w:t>
+      </w:r>
+      <w:bookmarkEnd w:id="30"/>
+    </w:p>
+    <w:p>
+      <w:pPr>
+        <w:pStyle w:val="ListParagraph"/>
+        <w:rPr>
+          <w:rStyle w:val="Hyperlink"/>
+        </w:rPr>
+      </w:pPr>
+      <w:hyperlink w:anchor="_Introduction_1" w:history="1">
+        <w:r>
+          <w:rPr>
+            <w:rStyle w:val="Hyperlink"/>
+          </w:rPr>
+          <w:t>Back to Introduction</w:t>
+        </w:r>
+      </w:hyperlink>
+    </w:p>
+    <w:p>
+      <w:pPr>
+        <w:pStyle w:val="ListParagraph"/>
+      </w:pPr>
+      <w:r>
+        <w:rPr>
+          <w:noProof/>
+        </w:rPr>
+        <w:drawing>
+          <wp:inline distT="0" distB="0" distL="0" distR="0" wp14:anchorId="1D2F4C60" wp14:editId="3A91B93F">
+            <wp:extent cx="3914775" cy="2505456"/>
+            <wp:effectExtent l="0" t="0" r="0" b="9525"/>
+            <wp:docPr id="3" name="Picture 3"/>
+            <wp:cNvGraphicFramePr>
+              <a:graphicFrameLocks xmlns:a="http://schemas.openxmlformats.org/drawingml/2006/main" noChangeAspect="1"/>
+            </wp:cNvGraphicFramePr>
+            <a:graphic xmlns:a="http://schemas.openxmlformats.org/drawingml/2006/main">
+              <a:graphicData uri="http://schemas.openxmlformats.org/drawingml/2006/picture">
+                <pic:pic xmlns:pic="http://schemas.openxmlformats.org/drawingml/2006/picture">
+                  <pic:nvPicPr>
+                    <pic:cNvPr id="0" name="Picture 1"/>
+                    <pic:cNvPicPr>
+                      <a:picLocks noChangeAspect="1" noChangeArrowheads="1"/>
+                    </pic:cNvPicPr>
+                  </pic:nvPicPr>
+                  <pic:blipFill>
+                    <a:blip r:embed="rId24" cstate="print">
+                      <a:extLst>
+                        <a:ext uri="{28A0092B-C50C-407E-A947-70E740481C1C}">
+                          <a14:useLocalDpi xmlns:a14="http://schemas.microsoft.com/office/drawing/2010/main" val="0"/>
+                        </a:ext>
+                      </a:extLst>
+                    </a:blip>
+                    <a:srcRect/>
+                    <a:stretch>
+                      <a:fillRect/>
+                    </a:stretch>
+                  </pic:blipFill>
+                  <pic:spPr bwMode="auto">
+                    <a:xfrm>
+                      <a:off x="0" y="0"/>
+                      <a:ext cx="3915730" cy="2506067"/>
+                    </a:xfrm>
+                    <a:prstGeom prst="rect">
+                      <a:avLst/>
+                    </a:prstGeom>
+                    <a:noFill/>
+                    <a:ln>
+                      <a:noFill/>
+                    </a:ln>
+                  </pic:spPr>
+                </pic:pic>
+              </a:graphicData>
+            </a:graphic>
+          </wp:inline>
+        </w:drawing>
+      </w:r>
     </w:p>
     <w:p>
       <w:pPr>
@@ -3182,11 +5250,11 @@
           <w:numId w:val="1"/>
         </w:numPr>
       </w:pPr>
-      <w:bookmarkStart w:id="16" w:name="_Toc222835381"/>
-      <w:r>
-        <w:t>Full Interview</w:t>
-      </w:r>
-      <w:bookmarkEnd w:id="16"/>
+      <w:bookmarkStart w:id="31" w:name="_Toc224131438"/>
+      <w:r>
+        <w:t>Code</w:t>
+      </w:r>
+      <w:bookmarkEnd w:id="31"/>
     </w:p>
     <w:p>
       <w:pPr>
@@ -3196,15 +5264,35 @@
           <w:numId w:val="1"/>
         </w:numPr>
       </w:pPr>
-      <w:bookmarkStart w:id="17" w:name="_Toc222835382"/>
+      <w:bookmarkStart w:id="32" w:name="_Full_Interview"/>
+      <w:bookmarkStart w:id="33" w:name="_Toc224131439"/>
+      <w:bookmarkEnd w:id="32"/>
+      <w:r>
+        <w:t>Full Interview</w:t>
+      </w:r>
+      <w:bookmarkEnd w:id="33"/>
+    </w:p>
+    <w:p>
+      <w:pPr>
+        <w:pStyle w:val="Heading2"/>
+        <w:numPr>
+          <w:ilvl w:val="0"/>
+          <w:numId w:val="1"/>
+        </w:numPr>
+      </w:pPr>
+      <w:bookmarkStart w:id="34" w:name="_Toc224131440"/>
       <w:r>
         <w:t>Testing</w:t>
       </w:r>
-      <w:bookmarkEnd w:id="17"/>
+      <w:bookmarkEnd w:id="34"/>
     </w:p>
     <w:p>
       <w:pPr>
         <w:ind w:firstLine="360"/>
+        <w:rPr>
+          <w:color w:val="467886" w:themeColor="hyperlink"/>
+          <w:u w:val="single"/>
+        </w:rPr>
       </w:pPr>
       <w:hyperlink w:anchor="_Final_Testing" w:history="1">
         <w:r>
@@ -3223,13 +5311,13 @@
           <w:numId w:val="2"/>
         </w:numPr>
       </w:pPr>
-      <w:bookmarkStart w:id="18" w:name="_Login_Test_Result"/>
-      <w:bookmarkStart w:id="19" w:name="_Toc222835383"/>
-      <w:bookmarkEnd w:id="18"/>
+      <w:bookmarkStart w:id="35" w:name="_Login_Test_Result"/>
+      <w:bookmarkStart w:id="36" w:name="_Toc224131441"/>
+      <w:bookmarkEnd w:id="35"/>
       <w:r>
         <w:t>Login Test Result</w:t>
       </w:r>
-      <w:bookmarkEnd w:id="19"/>
+      <w:bookmarkEnd w:id="36"/>
     </w:p>
     <w:p>
       <w:pPr>
@@ -3257,7 +5345,7 @@
                     </pic:cNvPicPr>
                   </pic:nvPicPr>
                   <pic:blipFill>
-                    <a:blip r:embed="rId10" cstate="print">
+                    <a:blip r:embed="rId25" cstate="print">
                       <a:extLst>
                         <a:ext uri="{28A0092B-C50C-407E-A947-70E740481C1C}">
                           <a14:useLocalDpi xmlns:a14="http://schemas.microsoft.com/office/drawing/2010/main" val="0"/>
@@ -3297,13 +5385,14 @@
           <w:numId w:val="2"/>
         </w:numPr>
       </w:pPr>
-      <w:bookmarkStart w:id="20" w:name="_Other_Test_Result"/>
-      <w:bookmarkStart w:id="21" w:name="_Toc222835384"/>
-      <w:bookmarkEnd w:id="20"/>
-      <w:r>
+      <w:bookmarkStart w:id="37" w:name="_Other_Test_Result"/>
+      <w:bookmarkStart w:id="38" w:name="_Toc224131442"/>
+      <w:bookmarkEnd w:id="37"/>
+      <w:r>
+        <w:lastRenderedPageBreak/>
         <w:t>Other Test Result</w:t>
       </w:r>
-      <w:bookmarkEnd w:id="21"/>
+      <w:bookmarkEnd w:id="38"/>
     </w:p>
     <w:p>
       <w:pPr>
@@ -3331,7 +5420,7 @@
                     </pic:cNvPicPr>
                   </pic:nvPicPr>
                   <pic:blipFill>
-                    <a:blip r:embed="rId11" cstate="print">
+                    <a:blip r:embed="rId26" cstate="print">
                       <a:extLst>
                         <a:ext uri="{28A0092B-C50C-407E-A947-70E740481C1C}">
                           <a14:useLocalDpi xmlns:a14="http://schemas.microsoft.com/office/drawing/2010/main" val="0"/>
@@ -3373,20 +5462,15 @@
       <w:pPr>
         <w:pStyle w:val="Heading1"/>
       </w:pPr>
-      <w:bookmarkStart w:id="22" w:name="_Toc222835385"/>
+      <w:bookmarkStart w:id="39" w:name="_Toc224131443"/>
       <w:r>
         <w:t>What should be here</w:t>
       </w:r>
-      <w:bookmarkEnd w:id="22"/>
+      <w:bookmarkEnd w:id="39"/>
     </w:p>
     <w:p>
       <w:r>
         <w:t>Additional research</w:t>
-      </w:r>
-    </w:p>
-    <w:p>
-      <w:r>
-        <w:t>Ful code listing (?)</w:t>
       </w:r>
     </w:p>
     <w:p/>
@@ -3654,9 +5738,9 @@
     </w:lvl>
   </w:abstractNum>
   <w:abstractNum w:abstractNumId="1" w15:restartNumberingAfterBreak="0">
-    <w:nsid w:val="3F85172D"/>
+    <w:nsid w:val="2E3C6E0B"/>
     <w:multiLevelType w:val="hybridMultilevel"/>
-    <w:tmpl w:val="9BBE4ACE"/>
+    <w:tmpl w:val="8B920B48"/>
     <w:lvl w:ilvl="0" w:tplc="08090015">
       <w:start w:val="1"/>
       <w:numFmt w:val="upperLetter"/>
@@ -3742,11 +5826,426 @@
       </w:pPr>
     </w:lvl>
   </w:abstractNum>
+  <w:abstractNum w:abstractNumId="2" w15:restartNumberingAfterBreak="0">
+    <w:nsid w:val="39B804B4"/>
+    <w:multiLevelType w:val="hybridMultilevel"/>
+    <w:tmpl w:val="05F84A36"/>
+    <w:lvl w:ilvl="0" w:tplc="08090015">
+      <w:start w:val="1"/>
+      <w:numFmt w:val="upperLetter"/>
+      <w:lvlText w:val="%1."/>
+      <w:lvlJc w:val="left"/>
+      <w:pPr>
+        <w:ind w:left="720" w:hanging="360"/>
+      </w:pPr>
+      <w:rPr>
+        <w:rFonts w:hint="default"/>
+      </w:rPr>
+    </w:lvl>
+    <w:lvl w:ilvl="1" w:tplc="08090019" w:tentative="1">
+      <w:start w:val="1"/>
+      <w:numFmt w:val="lowerLetter"/>
+      <w:lvlText w:val="%2."/>
+      <w:lvlJc w:val="left"/>
+      <w:pPr>
+        <w:ind w:left="1440" w:hanging="360"/>
+      </w:pPr>
+    </w:lvl>
+    <w:lvl w:ilvl="2" w:tplc="0809001B" w:tentative="1">
+      <w:start w:val="1"/>
+      <w:numFmt w:val="lowerRoman"/>
+      <w:lvlText w:val="%3."/>
+      <w:lvlJc w:val="right"/>
+      <w:pPr>
+        <w:ind w:left="2160" w:hanging="180"/>
+      </w:pPr>
+    </w:lvl>
+    <w:lvl w:ilvl="3" w:tplc="0809000F" w:tentative="1">
+      <w:start w:val="1"/>
+      <w:numFmt w:val="decimal"/>
+      <w:lvlText w:val="%4."/>
+      <w:lvlJc w:val="left"/>
+      <w:pPr>
+        <w:ind w:left="2880" w:hanging="360"/>
+      </w:pPr>
+    </w:lvl>
+    <w:lvl w:ilvl="4" w:tplc="08090019" w:tentative="1">
+      <w:start w:val="1"/>
+      <w:numFmt w:val="lowerLetter"/>
+      <w:lvlText w:val="%5."/>
+      <w:lvlJc w:val="left"/>
+      <w:pPr>
+        <w:ind w:left="3600" w:hanging="360"/>
+      </w:pPr>
+    </w:lvl>
+    <w:lvl w:ilvl="5" w:tplc="0809001B" w:tentative="1">
+      <w:start w:val="1"/>
+      <w:numFmt w:val="lowerRoman"/>
+      <w:lvlText w:val="%6."/>
+      <w:lvlJc w:val="right"/>
+      <w:pPr>
+        <w:ind w:left="4320" w:hanging="180"/>
+      </w:pPr>
+    </w:lvl>
+    <w:lvl w:ilvl="6" w:tplc="0809000F" w:tentative="1">
+      <w:start w:val="1"/>
+      <w:numFmt w:val="decimal"/>
+      <w:lvlText w:val="%7."/>
+      <w:lvlJc w:val="left"/>
+      <w:pPr>
+        <w:ind w:left="5040" w:hanging="360"/>
+      </w:pPr>
+    </w:lvl>
+    <w:lvl w:ilvl="7" w:tplc="08090019" w:tentative="1">
+      <w:start w:val="1"/>
+      <w:numFmt w:val="lowerLetter"/>
+      <w:lvlText w:val="%8."/>
+      <w:lvlJc w:val="left"/>
+      <w:pPr>
+        <w:ind w:left="5760" w:hanging="360"/>
+      </w:pPr>
+    </w:lvl>
+    <w:lvl w:ilvl="8" w:tplc="0809001B" w:tentative="1">
+      <w:start w:val="1"/>
+      <w:numFmt w:val="lowerRoman"/>
+      <w:lvlText w:val="%9."/>
+      <w:lvlJc w:val="right"/>
+      <w:pPr>
+        <w:ind w:left="6480" w:hanging="180"/>
+      </w:pPr>
+    </w:lvl>
+  </w:abstractNum>
+  <w:abstractNum w:abstractNumId="3" w15:restartNumberingAfterBreak="0">
+    <w:nsid w:val="3F85172D"/>
+    <w:multiLevelType w:val="hybridMultilevel"/>
+    <w:tmpl w:val="9BBE4ACE"/>
+    <w:lvl w:ilvl="0" w:tplc="08090015">
+      <w:start w:val="1"/>
+      <w:numFmt w:val="upperLetter"/>
+      <w:lvlText w:val="%1."/>
+      <w:lvlJc w:val="left"/>
+      <w:pPr>
+        <w:ind w:left="720" w:hanging="360"/>
+      </w:pPr>
+      <w:rPr>
+        <w:rFonts w:hint="default"/>
+      </w:rPr>
+    </w:lvl>
+    <w:lvl w:ilvl="1" w:tplc="08090019" w:tentative="1">
+      <w:start w:val="1"/>
+      <w:numFmt w:val="lowerLetter"/>
+      <w:lvlText w:val="%2."/>
+      <w:lvlJc w:val="left"/>
+      <w:pPr>
+        <w:ind w:left="1440" w:hanging="360"/>
+      </w:pPr>
+    </w:lvl>
+    <w:lvl w:ilvl="2" w:tplc="0809001B" w:tentative="1">
+      <w:start w:val="1"/>
+      <w:numFmt w:val="lowerRoman"/>
+      <w:lvlText w:val="%3."/>
+      <w:lvlJc w:val="right"/>
+      <w:pPr>
+        <w:ind w:left="2160" w:hanging="180"/>
+      </w:pPr>
+    </w:lvl>
+    <w:lvl w:ilvl="3" w:tplc="0809000F" w:tentative="1">
+      <w:start w:val="1"/>
+      <w:numFmt w:val="decimal"/>
+      <w:lvlText w:val="%4."/>
+      <w:lvlJc w:val="left"/>
+      <w:pPr>
+        <w:ind w:left="2880" w:hanging="360"/>
+      </w:pPr>
+    </w:lvl>
+    <w:lvl w:ilvl="4" w:tplc="08090019" w:tentative="1">
+      <w:start w:val="1"/>
+      <w:numFmt w:val="lowerLetter"/>
+      <w:lvlText w:val="%5."/>
+      <w:lvlJc w:val="left"/>
+      <w:pPr>
+        <w:ind w:left="3600" w:hanging="360"/>
+      </w:pPr>
+    </w:lvl>
+    <w:lvl w:ilvl="5" w:tplc="0809001B" w:tentative="1">
+      <w:start w:val="1"/>
+      <w:numFmt w:val="lowerRoman"/>
+      <w:lvlText w:val="%6."/>
+      <w:lvlJc w:val="right"/>
+      <w:pPr>
+        <w:ind w:left="4320" w:hanging="180"/>
+      </w:pPr>
+    </w:lvl>
+    <w:lvl w:ilvl="6" w:tplc="0809000F" w:tentative="1">
+      <w:start w:val="1"/>
+      <w:numFmt w:val="decimal"/>
+      <w:lvlText w:val="%7."/>
+      <w:lvlJc w:val="left"/>
+      <w:pPr>
+        <w:ind w:left="5040" w:hanging="360"/>
+      </w:pPr>
+    </w:lvl>
+    <w:lvl w:ilvl="7" w:tplc="08090019" w:tentative="1">
+      <w:start w:val="1"/>
+      <w:numFmt w:val="lowerLetter"/>
+      <w:lvlText w:val="%8."/>
+      <w:lvlJc w:val="left"/>
+      <w:pPr>
+        <w:ind w:left="5760" w:hanging="360"/>
+      </w:pPr>
+    </w:lvl>
+    <w:lvl w:ilvl="8" w:tplc="0809001B" w:tentative="1">
+      <w:start w:val="1"/>
+      <w:numFmt w:val="lowerRoman"/>
+      <w:lvlText w:val="%9."/>
+      <w:lvlJc w:val="right"/>
+      <w:pPr>
+        <w:ind w:left="6480" w:hanging="180"/>
+      </w:pPr>
+    </w:lvl>
+  </w:abstractNum>
+  <w:abstractNum w:abstractNumId="4" w15:restartNumberingAfterBreak="0">
+    <w:nsid w:val="7875763B"/>
+    <w:multiLevelType w:val="hybridMultilevel"/>
+    <w:tmpl w:val="8F4A92CA"/>
+    <w:lvl w:ilvl="0" w:tplc="2B4EC016">
+      <w:numFmt w:val="bullet"/>
+      <w:lvlText w:val="-"/>
+      <w:lvlJc w:val="left"/>
+      <w:pPr>
+        <w:ind w:left="720" w:hanging="360"/>
+      </w:pPr>
+      <w:rPr>
+        <w:rFonts w:ascii="Aptos" w:eastAsiaTheme="minorEastAsia" w:hAnsi="Aptos" w:cstheme="minorBidi" w:hint="default"/>
+      </w:rPr>
+    </w:lvl>
+    <w:lvl w:ilvl="1" w:tplc="08090003" w:tentative="1">
+      <w:start w:val="1"/>
+      <w:numFmt w:val="bullet"/>
+      <w:lvlText w:val="o"/>
+      <w:lvlJc w:val="left"/>
+      <w:pPr>
+        <w:ind w:left="1440" w:hanging="360"/>
+      </w:pPr>
+      <w:rPr>
+        <w:rFonts w:ascii="Courier New" w:hAnsi="Courier New" w:cs="Courier New" w:hint="default"/>
+      </w:rPr>
+    </w:lvl>
+    <w:lvl w:ilvl="2" w:tplc="08090005" w:tentative="1">
+      <w:start w:val="1"/>
+      <w:numFmt w:val="bullet"/>
+      <w:lvlText w:val=""/>
+      <w:lvlJc w:val="left"/>
+      <w:pPr>
+        <w:ind w:left="2160" w:hanging="360"/>
+      </w:pPr>
+      <w:rPr>
+        <w:rFonts w:ascii="Wingdings" w:hAnsi="Wingdings" w:hint="default"/>
+      </w:rPr>
+    </w:lvl>
+    <w:lvl w:ilvl="3" w:tplc="08090001" w:tentative="1">
+      <w:start w:val="1"/>
+      <w:numFmt w:val="bullet"/>
+      <w:lvlText w:val=""/>
+      <w:lvlJc w:val="left"/>
+      <w:pPr>
+        <w:ind w:left="2880" w:hanging="360"/>
+      </w:pPr>
+      <w:rPr>
+        <w:rFonts w:ascii="Symbol" w:hAnsi="Symbol" w:hint="default"/>
+      </w:rPr>
+    </w:lvl>
+    <w:lvl w:ilvl="4" w:tplc="08090003" w:tentative="1">
+      <w:start w:val="1"/>
+      <w:numFmt w:val="bullet"/>
+      <w:lvlText w:val="o"/>
+      <w:lvlJc w:val="left"/>
+      <w:pPr>
+        <w:ind w:left="3600" w:hanging="360"/>
+      </w:pPr>
+      <w:rPr>
+        <w:rFonts w:ascii="Courier New" w:hAnsi="Courier New" w:cs="Courier New" w:hint="default"/>
+      </w:rPr>
+    </w:lvl>
+    <w:lvl w:ilvl="5" w:tplc="08090005" w:tentative="1">
+      <w:start w:val="1"/>
+      <w:numFmt w:val="bullet"/>
+      <w:lvlText w:val=""/>
+      <w:lvlJc w:val="left"/>
+      <w:pPr>
+        <w:ind w:left="4320" w:hanging="360"/>
+      </w:pPr>
+      <w:rPr>
+        <w:rFonts w:ascii="Wingdings" w:hAnsi="Wingdings" w:hint="default"/>
+      </w:rPr>
+    </w:lvl>
+    <w:lvl w:ilvl="6" w:tplc="08090001" w:tentative="1">
+      <w:start w:val="1"/>
+      <w:numFmt w:val="bullet"/>
+      <w:lvlText w:val=""/>
+      <w:lvlJc w:val="left"/>
+      <w:pPr>
+        <w:ind w:left="5040" w:hanging="360"/>
+      </w:pPr>
+      <w:rPr>
+        <w:rFonts w:ascii="Symbol" w:hAnsi="Symbol" w:hint="default"/>
+      </w:rPr>
+    </w:lvl>
+    <w:lvl w:ilvl="7" w:tplc="08090003" w:tentative="1">
+      <w:start w:val="1"/>
+      <w:numFmt w:val="bullet"/>
+      <w:lvlText w:val="o"/>
+      <w:lvlJc w:val="left"/>
+      <w:pPr>
+        <w:ind w:left="5760" w:hanging="360"/>
+      </w:pPr>
+      <w:rPr>
+        <w:rFonts w:ascii="Courier New" w:hAnsi="Courier New" w:cs="Courier New" w:hint="default"/>
+      </w:rPr>
+    </w:lvl>
+    <w:lvl w:ilvl="8" w:tplc="08090005" w:tentative="1">
+      <w:start w:val="1"/>
+      <w:numFmt w:val="bullet"/>
+      <w:lvlText w:val=""/>
+      <w:lvlJc w:val="left"/>
+      <w:pPr>
+        <w:ind w:left="6480" w:hanging="360"/>
+      </w:pPr>
+      <w:rPr>
+        <w:rFonts w:ascii="Wingdings" w:hAnsi="Wingdings" w:hint="default"/>
+      </w:rPr>
+    </w:lvl>
+  </w:abstractNum>
+  <w:abstractNum w:abstractNumId="5" w15:restartNumberingAfterBreak="0">
+    <w:nsid w:val="7E4323ED"/>
+    <w:multiLevelType w:val="hybridMultilevel"/>
+    <w:tmpl w:val="D8804910"/>
+    <w:lvl w:ilvl="0" w:tplc="08090001">
+      <w:start w:val="1"/>
+      <w:numFmt w:val="bullet"/>
+      <w:lvlText w:val=""/>
+      <w:lvlJc w:val="left"/>
+      <w:pPr>
+        <w:ind w:left="720" w:hanging="360"/>
+      </w:pPr>
+      <w:rPr>
+        <w:rFonts w:ascii="Symbol" w:hAnsi="Symbol" w:hint="default"/>
+      </w:rPr>
+    </w:lvl>
+    <w:lvl w:ilvl="1" w:tplc="08090003">
+      <w:start w:val="1"/>
+      <w:numFmt w:val="bullet"/>
+      <w:lvlText w:val="o"/>
+      <w:lvlJc w:val="left"/>
+      <w:pPr>
+        <w:ind w:left="1440" w:hanging="360"/>
+      </w:pPr>
+      <w:rPr>
+        <w:rFonts w:ascii="Courier New" w:hAnsi="Courier New" w:cs="Courier New" w:hint="default"/>
+      </w:rPr>
+    </w:lvl>
+    <w:lvl w:ilvl="2" w:tplc="08090005" w:tentative="1">
+      <w:start w:val="1"/>
+      <w:numFmt w:val="bullet"/>
+      <w:lvlText w:val=""/>
+      <w:lvlJc w:val="left"/>
+      <w:pPr>
+        <w:ind w:left="2160" w:hanging="360"/>
+      </w:pPr>
+      <w:rPr>
+        <w:rFonts w:ascii="Wingdings" w:hAnsi="Wingdings" w:hint="default"/>
+      </w:rPr>
+    </w:lvl>
+    <w:lvl w:ilvl="3" w:tplc="08090001" w:tentative="1">
+      <w:start w:val="1"/>
+      <w:numFmt w:val="bullet"/>
+      <w:lvlText w:val=""/>
+      <w:lvlJc w:val="left"/>
+      <w:pPr>
+        <w:ind w:left="2880" w:hanging="360"/>
+      </w:pPr>
+      <w:rPr>
+        <w:rFonts w:ascii="Symbol" w:hAnsi="Symbol" w:hint="default"/>
+      </w:rPr>
+    </w:lvl>
+    <w:lvl w:ilvl="4" w:tplc="08090003" w:tentative="1">
+      <w:start w:val="1"/>
+      <w:numFmt w:val="bullet"/>
+      <w:lvlText w:val="o"/>
+      <w:lvlJc w:val="left"/>
+      <w:pPr>
+        <w:ind w:left="3600" w:hanging="360"/>
+      </w:pPr>
+      <w:rPr>
+        <w:rFonts w:ascii="Courier New" w:hAnsi="Courier New" w:cs="Courier New" w:hint="default"/>
+      </w:rPr>
+    </w:lvl>
+    <w:lvl w:ilvl="5" w:tplc="08090005" w:tentative="1">
+      <w:start w:val="1"/>
+      <w:numFmt w:val="bullet"/>
+      <w:lvlText w:val=""/>
+      <w:lvlJc w:val="left"/>
+      <w:pPr>
+        <w:ind w:left="4320" w:hanging="360"/>
+      </w:pPr>
+      <w:rPr>
+        <w:rFonts w:ascii="Wingdings" w:hAnsi="Wingdings" w:hint="default"/>
+      </w:rPr>
+    </w:lvl>
+    <w:lvl w:ilvl="6" w:tplc="08090001" w:tentative="1">
+      <w:start w:val="1"/>
+      <w:numFmt w:val="bullet"/>
+      <w:lvlText w:val=""/>
+      <w:lvlJc w:val="left"/>
+      <w:pPr>
+        <w:ind w:left="5040" w:hanging="360"/>
+      </w:pPr>
+      <w:rPr>
+        <w:rFonts w:ascii="Symbol" w:hAnsi="Symbol" w:hint="default"/>
+      </w:rPr>
+    </w:lvl>
+    <w:lvl w:ilvl="7" w:tplc="08090003" w:tentative="1">
+      <w:start w:val="1"/>
+      <w:numFmt w:val="bullet"/>
+      <w:lvlText w:val="o"/>
+      <w:lvlJc w:val="left"/>
+      <w:pPr>
+        <w:ind w:left="5760" w:hanging="360"/>
+      </w:pPr>
+      <w:rPr>
+        <w:rFonts w:ascii="Courier New" w:hAnsi="Courier New" w:cs="Courier New" w:hint="default"/>
+      </w:rPr>
+    </w:lvl>
+    <w:lvl w:ilvl="8" w:tplc="08090005" w:tentative="1">
+      <w:start w:val="1"/>
+      <w:numFmt w:val="bullet"/>
+      <w:lvlText w:val=""/>
+      <w:lvlJc w:val="left"/>
+      <w:pPr>
+        <w:ind w:left="6480" w:hanging="360"/>
+      </w:pPr>
+      <w:rPr>
+        <w:rFonts w:ascii="Wingdings" w:hAnsi="Wingdings" w:hint="default"/>
+      </w:rPr>
+    </w:lvl>
+  </w:abstractNum>
   <w:num w:numId="1">
     <w:abstractNumId w:val="0"/>
   </w:num>
   <w:num w:numId="2">
+    <w:abstractNumId w:val="3"/>
+  </w:num>
+  <w:num w:numId="3">
     <w:abstractNumId w:val="1"/>
+  </w:num>
+  <w:num w:numId="4">
+    <w:abstractNumId w:val="2"/>
+  </w:num>
+  <w:num w:numId="5">
+    <w:abstractNumId w:val="5"/>
+  </w:num>
+  <w:num w:numId="6">
+    <w:abstractNumId w:val="4"/>
   </w:num>
 </w:numbering>
 </file>
@@ -4151,7 +6650,7 @@
   <w:style w:type="paragraph" w:default="1" w:styleId="Normal">
     <w:name w:val="Normal"/>
     <w:qFormat/>
-    <w:rsid w:val="003F3F07"/>
+    <w:rsid w:val="00220E8C"/>
     <w:pPr>
       <w:spacing w:after="0" w:line="240" w:lineRule="auto"/>
     </w:pPr>
@@ -4169,11 +6668,16 @@
     <w:link w:val="Heading1Char"/>
     <w:uiPriority w:val="9"/>
     <w:qFormat/>
-    <w:rsid w:val="00E270D5"/>
+    <w:rsid w:val="004C0851"/>
     <w:pPr>
       <w:keepNext/>
       <w:keepLines/>
-      <w:spacing w:before="360" w:after="80" w:line="360" w:lineRule="auto"/>
+      <w:pBdr>
+        <w:top w:val="single" w:sz="4" w:space="1" w:color="auto"/>
+        <w:bottom w:val="single" w:sz="4" w:space="1" w:color="auto"/>
+      </w:pBdr>
+      <w:spacing w:before="360" w:after="360"/>
+      <w:jc w:val="center"/>
       <w:outlineLvl w:val="0"/>
     </w:pPr>
     <w:rPr>
@@ -4181,7 +6685,6 @@
       <w:color w:val="0F4761" w:themeColor="accent1" w:themeShade="BF"/>
       <w:sz w:val="40"/>
       <w:szCs w:val="40"/>
-      <w:u w:val="single"/>
     </w:rPr>
   </w:style>
   <w:style w:type="paragraph" w:styleId="Heading2">
@@ -4235,7 +6738,6 @@
     <w:next w:val="Normal"/>
     <w:link w:val="Heading4Char"/>
     <w:uiPriority w:val="9"/>
-    <w:semiHidden/>
     <w:unhideWhenUsed/>
     <w:qFormat/>
     <w:rsid w:val="00152F3D"/>
@@ -4258,7 +6760,6 @@
     <w:next w:val="Normal"/>
     <w:link w:val="Heading5Char"/>
     <w:uiPriority w:val="9"/>
-    <w:semiHidden/>
     <w:unhideWhenUsed/>
     <w:qFormat/>
     <w:rsid w:val="00152F3D"/>
@@ -4391,13 +6892,15 @@
     <w:basedOn w:val="DefaultParagraphFont"/>
     <w:link w:val="Heading1"/>
     <w:uiPriority w:val="9"/>
-    <w:rsid w:val="00E270D5"/>
+    <w:rsid w:val="004C0851"/>
     <w:rPr>
       <w:rFonts w:asciiTheme="majorHAnsi" w:eastAsiaTheme="majorEastAsia" w:hAnsiTheme="majorHAnsi" w:cstheme="majorBidi"/>
       <w:color w:val="0F4761" w:themeColor="accent1" w:themeShade="BF"/>
+      <w:kern w:val="0"/>
       <w:sz w:val="40"/>
       <w:szCs w:val="40"/>
-      <w:u w:val="single"/>
+      <w:lang w:val="en-US"/>
+      <w14:ligatures w14:val="none"/>
     </w:rPr>
   </w:style>
   <w:style w:type="character" w:customStyle="1" w:styleId="Heading2Char">
@@ -4432,7 +6935,6 @@
     <w:basedOn w:val="DefaultParagraphFont"/>
     <w:link w:val="Heading4"/>
     <w:uiPriority w:val="9"/>
-    <w:semiHidden/>
     <w:rsid w:val="00152F3D"/>
     <w:rPr>
       <w:rFonts w:eastAsiaTheme="majorEastAsia" w:cstheme="majorBidi"/>
@@ -4446,7 +6948,6 @@
     <w:basedOn w:val="DefaultParagraphFont"/>
     <w:link w:val="Heading5"/>
     <w:uiPriority w:val="9"/>
-    <w:semiHidden/>
     <w:rsid w:val="00152F3D"/>
     <w:rPr>
       <w:rFonts w:eastAsiaTheme="majorEastAsia" w:cstheme="majorBidi"/>
@@ -4864,6 +7365,33 @@
       <w:ind w:left="440"/>
     </w:pPr>
   </w:style>
+  <w:style w:type="paragraph" w:customStyle="1" w:styleId="ImageCaption">
+    <w:name w:val="ImageCaption"/>
+    <w:basedOn w:val="Normal"/>
+    <w:link w:val="ImageCaptionChar"/>
+    <w:qFormat/>
+    <w:rsid w:val="001C04FA"/>
+    <w:rPr>
+      <w:color w:val="ADADAD" w:themeColor="background2" w:themeShade="BF"/>
+      <w:sz w:val="16"/>
+      <w:szCs w:val="16"/>
+    </w:rPr>
+  </w:style>
+  <w:style w:type="character" w:customStyle="1" w:styleId="ImageCaptionChar">
+    <w:name w:val="ImageCaption Char"/>
+    <w:basedOn w:val="DefaultParagraphFont"/>
+    <w:link w:val="ImageCaption"/>
+    <w:rsid w:val="001C04FA"/>
+    <w:rPr>
+      <w:rFonts w:eastAsiaTheme="minorEastAsia"/>
+      <w:color w:val="ADADAD" w:themeColor="background2" w:themeShade="BF"/>
+      <w:kern w:val="0"/>
+      <w:sz w:val="16"/>
+      <w:szCs w:val="16"/>
+      <w:lang w:val="en-US"/>
+      <w14:ligatures w14:val="none"/>
+    </w:rPr>
+  </w:style>
 </w:styles>
 </file>
 

</xml_diff>